<commit_message>
add readme && add submit dir
</commit_message>
<xml_diff>
--- a/labs/lab_report/finished_report/DB实验2+数据库的单表查询操作.docx
+++ b/labs/lab_report/finished_report/DB实验2+数据库的单表查询操作.docx
@@ -1,6 +1,6 @@
 
 <file path=word/document.xml><?xml version="1.0" encoding="utf-8"?>
-<w:document xmlns:wpc="http://schemas.microsoft.com/office/word/2010/wordprocessingCanvas" xmlns:cx="http://schemas.microsoft.com/office/drawing/2014/chartex" xmlns:cx1="http://schemas.microsoft.com/office/drawing/2015/9/8/chartex" xmlns:cx2="http://schemas.microsoft.com/office/drawing/2015/10/21/chartex" xmlns:cx3="http://schemas.microsoft.com/office/drawing/2016/5/9/chartex" xmlns:cx4="http://schemas.microsoft.com/office/drawing/2016/5/10/chartex" xmlns:cx5="http://schemas.microsoft.com/office/drawing/2016/5/11/chartex" xmlns:cx6="http://schemas.microsoft.com/office/drawing/2016/5/12/chartex" xmlns:cx7="http://schemas.microsoft.com/office/drawing/2016/5/13/chartex" xmlns:cx8="http://schemas.microsoft.com/office/drawing/2016/5/14/chartex" xmlns:mc="http://schemas.openxmlformats.org/markup-compatibility/2006" xmlns:aink="http://schemas.microsoft.com/office/drawing/2016/ink" xmlns:am3d="http://schemas.microsoft.com/office/drawing/2017/model3d" xmlns:o="urn:schemas-microsoft-com:office:office" xmlns:oel="http://schemas.microsoft.com/office/2019/extlst" xmlns:r="http://schemas.openxmlformats.org/officeDocument/2006/relationships" xmlns:m="http://schemas.openxmlformats.org/officeDocument/2006/math" xmlns:v="urn:schemas-microsoft-com:vml" xmlns:wp14="http://schemas.microsoft.com/office/word/2010/wordprocessingDrawing" xmlns:wp="http://schemas.openxmlformats.org/drawingml/2006/wordprocessingDrawing" xmlns:w10="urn:schemas-microsoft-com:office:word" xmlns:w="http://schemas.openxmlformats.org/wordprocessingml/2006/main" xmlns:w14="http://schemas.microsoft.com/office/word/2010/wordml" xmlns:w15="http://schemas.microsoft.com/office/word/2012/wordml" xmlns:w16cex="http://schemas.microsoft.com/office/word/2018/wordml/cex" xmlns:w16cid="http://schemas.microsoft.com/office/word/2016/wordml/cid" xmlns:w16="http://schemas.microsoft.com/office/word/2018/wordml" xmlns:w16sdtdh="http://schemas.microsoft.com/office/word/2020/wordml/sdtdatahash" xmlns:w16se="http://schemas.microsoft.com/office/word/2015/wordml/symex" xmlns:wpg="http://schemas.microsoft.com/office/word/2010/wordprocessingGroup" xmlns:wpi="http://schemas.microsoft.com/office/word/2010/wordprocessingInk" xmlns:wne="http://schemas.microsoft.com/office/word/2006/wordml" xmlns:wps="http://schemas.microsoft.com/office/word/2010/wordprocessingShape" mc:Ignorable="w14 w15 w16se w16cid w16 w16cex w16sdtdh wp14">
+<w:document xmlns:wpc="http://schemas.microsoft.com/office/word/2010/wordprocessingCanvas" xmlns:cx="http://schemas.microsoft.com/office/drawing/2014/chartex" xmlns:mc="http://schemas.openxmlformats.org/markup-compatibility/2006" xmlns:o="urn:schemas-microsoft-com:office:office" xmlns:r="http://schemas.openxmlformats.org/officeDocument/2006/relationships" xmlns:m="http://schemas.openxmlformats.org/officeDocument/2006/math" xmlns:v="urn:schemas-microsoft-com:vml" xmlns:wp14="http://schemas.microsoft.com/office/word/2010/wordprocessingDrawing" xmlns:wp="http://schemas.openxmlformats.org/drawingml/2006/wordprocessingDrawing" xmlns:w10="urn:schemas-microsoft-com:office:word" xmlns:w="http://schemas.openxmlformats.org/wordprocessingml/2006/main" xmlns:w14="http://schemas.microsoft.com/office/word/2010/wordml" xmlns:w15="http://schemas.microsoft.com/office/word/2012/wordml" xmlns:w16se="http://schemas.microsoft.com/office/word/2015/wordml/symex" xmlns:wpg="http://schemas.microsoft.com/office/word/2010/wordprocessingGroup" xmlns:wpi="http://schemas.microsoft.com/office/word/2010/wordprocessingInk" xmlns:wne="http://schemas.microsoft.com/office/word/2006/wordml" xmlns:wps="http://schemas.microsoft.com/office/word/2010/wordprocessingShape" mc:Ignorable="w14 w15 w16se wp14">
   <w:body>
     <w:tbl>
       <w:tblPr>
@@ -216,14 +216,12 @@
             <w:pPr>
               <w:jc w:val="center"/>
             </w:pPr>
-            <w:proofErr w:type="gramStart"/>
             <w:r>
               <w:rPr>
                 <w:rFonts w:hint="eastAsia"/>
               </w:rPr>
               <w:t>计科</w:t>
             </w:r>
-            <w:proofErr w:type="gramEnd"/>
             <w:r>
               <w:rPr>
                 <w:rFonts w:hint="eastAsia"/>
@@ -241,14 +239,12 @@
             <w:pPr>
               <w:jc w:val="center"/>
             </w:pPr>
-            <w:proofErr w:type="gramStart"/>
             <w:r>
               <w:rPr>
                 <w:rFonts w:hint="eastAsia"/>
               </w:rPr>
               <w:t>段辉园</w:t>
             </w:r>
-            <w:proofErr w:type="gramEnd"/>
           </w:p>
         </w:tc>
         <w:tc>
@@ -304,7 +300,7 @@
           <w:b/>
           <w:sz w:val="32"/>
         </w:rPr>
-        <w:t>实验二</w:t>
+        <w:t>实验三</w:t>
       </w:r>
       <w:r>
         <w:rPr>
@@ -320,8 +316,18 @@
           <w:b/>
           <w:sz w:val="32"/>
         </w:rPr>
-        <w:t>数据库的单表查询操作</w:t>
-      </w:r>
+        <w:t>数据</w:t>
+      </w:r>
+      <w:r>
+        <w:rPr>
+          <w:rFonts w:hint="eastAsia"/>
+          <w:b/>
+          <w:sz w:val="32"/>
+        </w:rPr>
+        <w:t>查询</w:t>
+      </w:r>
+      <w:bookmarkStart w:id="0" w:name="_GoBack"/>
+      <w:bookmarkEnd w:id="0"/>
     </w:p>
     <w:p>
       <w:pPr>
@@ -587,25 +593,7 @@
           <w:kern w:val="0"/>
           <w:sz w:val="24"/>
         </w:rPr>
-        <w:t>掌握对查询结果排序、去重和分</w:t>
-      </w:r>
-      <w:proofErr w:type="gramStart"/>
-      <w:r>
-        <w:rPr>
-          <w:rFonts w:cs="宋体" w:hint="eastAsia"/>
-          <w:kern w:val="0"/>
-          <w:sz w:val="24"/>
-        </w:rPr>
-        <w:t>页显示</w:t>
-      </w:r>
-      <w:proofErr w:type="gramEnd"/>
-      <w:r>
-        <w:rPr>
-          <w:rFonts w:cs="宋体" w:hint="eastAsia"/>
-          <w:kern w:val="0"/>
-          <w:sz w:val="24"/>
-        </w:rPr>
-        <w:t>操作。</w:t>
+        <w:t>掌握对查询结果排序、去重和分页显示操作。</w:t>
       </w:r>
     </w:p>
     <w:p>
@@ -949,7 +937,6 @@
         </w:rPr>
         <w:t>导入实验一中备份的</w:t>
       </w:r>
-      <w:proofErr w:type="spellStart"/>
       <w:r>
         <w:rPr>
           <w:rFonts w:hint="eastAsia"/>
@@ -960,7 +947,6 @@
         </w:rPr>
         <w:t>db_school</w:t>
       </w:r>
-      <w:proofErr w:type="spellEnd"/>
       <w:r>
         <w:rPr>
           <w:rFonts w:hint="eastAsia"/>
@@ -1168,63 +1154,7 @@
         <w:rPr>
           <w:szCs w:val="21"/>
         </w:rPr>
-        <w:t xml:space="preserve">select </w:t>
-      </w:r>
-      <w:proofErr w:type="spellStart"/>
-      <w:r>
-        <w:rPr>
-          <w:szCs w:val="21"/>
-        </w:rPr>
-        <w:t>sno</w:t>
-      </w:r>
-      <w:proofErr w:type="spellEnd"/>
-      <w:r>
-        <w:rPr>
-          <w:szCs w:val="21"/>
-        </w:rPr>
-        <w:t xml:space="preserve">, </w:t>
-      </w:r>
-      <w:proofErr w:type="spellStart"/>
-      <w:r>
-        <w:rPr>
-          <w:szCs w:val="21"/>
-        </w:rPr>
-        <w:t>sname</w:t>
-      </w:r>
-      <w:proofErr w:type="spellEnd"/>
-      <w:r>
-        <w:rPr>
-          <w:szCs w:val="21"/>
-        </w:rPr>
-        <w:t xml:space="preserve">, </w:t>
-      </w:r>
-      <w:proofErr w:type="spellStart"/>
-      <w:r>
-        <w:rPr>
-          <w:szCs w:val="21"/>
-        </w:rPr>
-        <w:t>ssex</w:t>
-      </w:r>
-      <w:proofErr w:type="spellEnd"/>
-      <w:r>
-        <w:rPr>
-          <w:szCs w:val="21"/>
-        </w:rPr>
-        <w:t xml:space="preserve">, </w:t>
-      </w:r>
-      <w:proofErr w:type="spellStart"/>
-      <w:r>
-        <w:rPr>
-          <w:szCs w:val="21"/>
-        </w:rPr>
-        <w:t>sbirthday</w:t>
-      </w:r>
-      <w:proofErr w:type="spellEnd"/>
-      <w:r>
-        <w:rPr>
-          <w:szCs w:val="21"/>
-        </w:rPr>
-        <w:t xml:space="preserve"> from student;</w:t>
+        <w:t>select sno, sname, ssex, sbirthday from student;</w:t>
       </w:r>
     </w:p>
     <w:p>
@@ -1347,21 +1277,7 @@
         <w:rPr>
           <w:szCs w:val="21"/>
         </w:rPr>
-        <w:t xml:space="preserve">select </w:t>
-      </w:r>
-      <w:proofErr w:type="spellStart"/>
-      <w:r>
-        <w:rPr>
-          <w:szCs w:val="21"/>
-        </w:rPr>
-        <w:t>cname</w:t>
-      </w:r>
-      <w:proofErr w:type="spellEnd"/>
-      <w:r>
-        <w:rPr>
-          <w:szCs w:val="21"/>
-        </w:rPr>
-        <w:t xml:space="preserve"> from course;</w:t>
+        <w:t>select cname from course;</w:t>
       </w:r>
     </w:p>
     <w:p>
@@ -1478,23 +1394,7 @@
           <w:rFonts w:hint="eastAsia"/>
           <w:szCs w:val="21"/>
         </w:rPr>
-        <w:t>门课程</w:t>
-      </w:r>
-      <w:proofErr w:type="gramStart"/>
-      <w:r>
-        <w:rPr>
-          <w:rFonts w:hint="eastAsia"/>
-          <w:szCs w:val="21"/>
-        </w:rPr>
-        <w:t>的课号及</w:t>
-      </w:r>
-      <w:proofErr w:type="gramEnd"/>
-      <w:r>
-        <w:rPr>
-          <w:rFonts w:hint="eastAsia"/>
-          <w:szCs w:val="21"/>
-        </w:rPr>
-        <w:t>课程名称。</w:t>
+        <w:t>门课程的课号及课程名称。</w:t>
       </w:r>
     </w:p>
     <w:p>
@@ -1515,35 +1415,7 @@
         <w:rPr>
           <w:szCs w:val="21"/>
         </w:rPr>
-        <w:t xml:space="preserve">select </w:t>
-      </w:r>
-      <w:proofErr w:type="spellStart"/>
-      <w:r>
-        <w:rPr>
-          <w:szCs w:val="21"/>
-        </w:rPr>
-        <w:t>cno</w:t>
-      </w:r>
-      <w:proofErr w:type="spellEnd"/>
-      <w:r>
-        <w:rPr>
-          <w:szCs w:val="21"/>
-        </w:rPr>
-        <w:t xml:space="preserve">, </w:t>
-      </w:r>
-      <w:proofErr w:type="spellStart"/>
-      <w:r>
-        <w:rPr>
-          <w:szCs w:val="21"/>
-        </w:rPr>
-        <w:t>cname</w:t>
-      </w:r>
-      <w:proofErr w:type="spellEnd"/>
-      <w:r>
-        <w:rPr>
-          <w:szCs w:val="21"/>
-        </w:rPr>
-        <w:t xml:space="preserve"> from course limit 10;</w:t>
+        <w:t>select cno, cname from course limit 10;</w:t>
       </w:r>
     </w:p>
     <w:p>
@@ -1675,39 +1547,7 @@
           <w:rFonts w:hint="eastAsia"/>
           <w:szCs w:val="21"/>
         </w:rPr>
-        <w:t xml:space="preserve">select </w:t>
-      </w:r>
-      <w:proofErr w:type="spellStart"/>
-      <w:r>
-        <w:rPr>
-          <w:rFonts w:hint="eastAsia"/>
-          <w:szCs w:val="21"/>
-        </w:rPr>
-        <w:t>sname</w:t>
-      </w:r>
-      <w:proofErr w:type="spellEnd"/>
-      <w:r>
-        <w:rPr>
-          <w:rFonts w:hint="eastAsia"/>
-          <w:szCs w:val="21"/>
-        </w:rPr>
-        <w:t>, (year(CURDATE()) - year(</w:t>
-      </w:r>
-      <w:proofErr w:type="spellStart"/>
-      <w:r>
-        <w:rPr>
-          <w:rFonts w:hint="eastAsia"/>
-          <w:szCs w:val="21"/>
-        </w:rPr>
-        <w:t>sbirthday</w:t>
-      </w:r>
-      <w:proofErr w:type="spellEnd"/>
-      <w:r>
-        <w:rPr>
-          <w:rFonts w:hint="eastAsia"/>
-          <w:szCs w:val="21"/>
-        </w:rPr>
-        <w:t xml:space="preserve">)) as </w:t>
+        <w:t xml:space="preserve">select sname, (year(CURDATE()) - year(sbirthday)) as </w:t>
       </w:r>
       <w:r>
         <w:rPr>
@@ -1860,23 +1700,7 @@
           <w:rFonts w:hint="eastAsia"/>
           <w:szCs w:val="21"/>
         </w:rPr>
-        <w:t xml:space="preserve">select </w:t>
-      </w:r>
-      <w:proofErr w:type="spellStart"/>
-      <w:r>
-        <w:rPr>
-          <w:rFonts w:hint="eastAsia"/>
-          <w:szCs w:val="21"/>
-        </w:rPr>
-        <w:t>sno</w:t>
-      </w:r>
-      <w:proofErr w:type="spellEnd"/>
-      <w:r>
-        <w:rPr>
-          <w:rFonts w:hint="eastAsia"/>
-          <w:szCs w:val="21"/>
-        </w:rPr>
-        <w:t xml:space="preserve"> as </w:t>
+        <w:t xml:space="preserve">select sno as </w:t>
       </w:r>
       <w:r>
         <w:rPr>
@@ -1890,23 +1714,7 @@
           <w:rFonts w:hint="eastAsia"/>
           <w:szCs w:val="21"/>
         </w:rPr>
-        <w:t xml:space="preserve">, </w:t>
-      </w:r>
-      <w:proofErr w:type="spellStart"/>
-      <w:r>
-        <w:rPr>
-          <w:rFonts w:hint="eastAsia"/>
-          <w:szCs w:val="21"/>
-        </w:rPr>
-        <w:t>sname</w:t>
-      </w:r>
-      <w:proofErr w:type="spellEnd"/>
-      <w:r>
-        <w:rPr>
-          <w:rFonts w:hint="eastAsia"/>
-          <w:szCs w:val="21"/>
-        </w:rPr>
-        <w:t xml:space="preserve"> as </w:t>
+        <w:t xml:space="preserve">, sname as </w:t>
       </w:r>
       <w:r>
         <w:rPr>
@@ -1920,23 +1728,7 @@
           <w:rFonts w:hint="eastAsia"/>
           <w:szCs w:val="21"/>
         </w:rPr>
-        <w:t xml:space="preserve"> from student where </w:t>
-      </w:r>
-      <w:proofErr w:type="spellStart"/>
-      <w:r>
-        <w:rPr>
-          <w:rFonts w:hint="eastAsia"/>
-          <w:szCs w:val="21"/>
-        </w:rPr>
-        <w:t>ssex</w:t>
-      </w:r>
-      <w:proofErr w:type="spellEnd"/>
-      <w:r>
-        <w:rPr>
-          <w:rFonts w:hint="eastAsia"/>
-          <w:szCs w:val="21"/>
-        </w:rPr>
-        <w:t xml:space="preserve"> = '</w:t>
+        <w:t xml:space="preserve"> from student where ssex = '</w:t>
       </w:r>
       <w:r>
         <w:rPr>
@@ -1950,23 +1742,7 @@
           <w:rFonts w:hint="eastAsia"/>
           <w:szCs w:val="21"/>
         </w:rPr>
-        <w:t>' and (year(CURDATE()) - year(</w:t>
-      </w:r>
-      <w:proofErr w:type="spellStart"/>
-      <w:r>
-        <w:rPr>
-          <w:rFonts w:hint="eastAsia"/>
-          <w:szCs w:val="21"/>
-        </w:rPr>
-        <w:t>sbirthday</w:t>
-      </w:r>
-      <w:proofErr w:type="spellEnd"/>
-      <w:r>
-        <w:rPr>
-          <w:rFonts w:hint="eastAsia"/>
-          <w:szCs w:val="21"/>
-        </w:rPr>
-        <w:t>)) &gt; 18;</w:t>
+        <w:t>' and (year(CURDATE()) - year(sbirthday)) &gt; 18;</w:t>
       </w:r>
     </w:p>
     <w:p>
@@ -2090,23 +1866,7 @@
           <w:rFonts w:hint="eastAsia"/>
           <w:szCs w:val="21"/>
         </w:rPr>
-        <w:t xml:space="preserve">select * from student where </w:t>
-      </w:r>
-      <w:proofErr w:type="spellStart"/>
-      <w:r>
-        <w:rPr>
-          <w:rFonts w:hint="eastAsia"/>
-          <w:szCs w:val="21"/>
-        </w:rPr>
-        <w:t>ssex</w:t>
-      </w:r>
-      <w:proofErr w:type="spellEnd"/>
-      <w:r>
-        <w:rPr>
-          <w:rFonts w:hint="eastAsia"/>
-          <w:szCs w:val="21"/>
-        </w:rPr>
-        <w:t xml:space="preserve"> = '</w:t>
+        <w:t>select * from student where ssex = '</w:t>
       </w:r>
       <w:r>
         <w:rPr>
@@ -2224,7 +1984,6 @@
         </w:rPr>
         <w:t>查询所有任课教师的姓名（</w:t>
       </w:r>
-      <w:proofErr w:type="spellStart"/>
       <w:r>
         <w:rPr>
           <w:rFonts w:hint="eastAsia"/>
@@ -2232,7 +1991,6 @@
         </w:rPr>
         <w:t>tname</w:t>
       </w:r>
-      <w:proofErr w:type="spellEnd"/>
       <w:r>
         <w:rPr>
           <w:rFonts w:hint="eastAsia"/>
@@ -2240,7 +1998,6 @@
         </w:rPr>
         <w:t>）和所在系别（</w:t>
       </w:r>
-      <w:proofErr w:type="spellStart"/>
       <w:r>
         <w:rPr>
           <w:rFonts w:hint="eastAsia"/>
@@ -2248,7 +2005,6 @@
         </w:rPr>
         <w:t>tdept</w:t>
       </w:r>
-      <w:proofErr w:type="spellEnd"/>
       <w:r>
         <w:rPr>
           <w:rFonts w:hint="eastAsia"/>
@@ -2276,23 +2032,7 @@
           <w:rFonts w:hint="eastAsia"/>
           <w:szCs w:val="21"/>
         </w:rPr>
-        <w:t xml:space="preserve">select </w:t>
-      </w:r>
-      <w:proofErr w:type="spellStart"/>
-      <w:r>
-        <w:rPr>
-          <w:rFonts w:hint="eastAsia"/>
-          <w:szCs w:val="21"/>
-        </w:rPr>
-        <w:t>tname</w:t>
-      </w:r>
-      <w:proofErr w:type="spellEnd"/>
-      <w:r>
-        <w:rPr>
-          <w:rFonts w:hint="eastAsia"/>
-          <w:szCs w:val="21"/>
-        </w:rPr>
-        <w:t xml:space="preserve"> as '</w:t>
+        <w:t>select tname as '</w:t>
       </w:r>
       <w:r>
         <w:rPr>
@@ -2306,23 +2046,7 @@
           <w:rFonts w:hint="eastAsia"/>
           <w:szCs w:val="21"/>
         </w:rPr>
-        <w:t xml:space="preserve">', </w:t>
-      </w:r>
-      <w:proofErr w:type="spellStart"/>
-      <w:r>
-        <w:rPr>
-          <w:rFonts w:hint="eastAsia"/>
-          <w:szCs w:val="21"/>
-        </w:rPr>
-        <w:t>tdept</w:t>
-      </w:r>
-      <w:proofErr w:type="spellEnd"/>
-      <w:r>
-        <w:rPr>
-          <w:rFonts w:hint="eastAsia"/>
-          <w:szCs w:val="21"/>
-        </w:rPr>
-        <w:t xml:space="preserve"> as '</w:t>
+        <w:t>', tdept as '</w:t>
       </w:r>
       <w:r>
         <w:rPr>
@@ -2461,23 +2185,7 @@
           <w:rFonts w:hint="eastAsia"/>
           <w:szCs w:val="21"/>
         </w:rPr>
-        <w:t xml:space="preserve">select </w:t>
-      </w:r>
-      <w:proofErr w:type="spellStart"/>
-      <w:r>
-        <w:rPr>
-          <w:rFonts w:hint="eastAsia"/>
-          <w:szCs w:val="21"/>
-        </w:rPr>
-        <w:t>sname</w:t>
-      </w:r>
-      <w:proofErr w:type="spellEnd"/>
-      <w:r>
-        <w:rPr>
-          <w:rFonts w:hint="eastAsia"/>
-          <w:szCs w:val="21"/>
-        </w:rPr>
-        <w:t xml:space="preserve"> as '</w:t>
+        <w:t>select sname as '</w:t>
       </w:r>
       <w:r>
         <w:rPr>
@@ -2491,23 +2199,7 @@
           <w:rFonts w:hint="eastAsia"/>
           <w:szCs w:val="21"/>
         </w:rPr>
-        <w:t xml:space="preserve">', </w:t>
-      </w:r>
-      <w:proofErr w:type="spellStart"/>
-      <w:r>
-        <w:rPr>
-          <w:rFonts w:hint="eastAsia"/>
-          <w:szCs w:val="21"/>
-        </w:rPr>
-        <w:t>ssex</w:t>
-      </w:r>
-      <w:proofErr w:type="spellEnd"/>
-      <w:r>
-        <w:rPr>
-          <w:rFonts w:hint="eastAsia"/>
-          <w:szCs w:val="21"/>
-        </w:rPr>
-        <w:t xml:space="preserve"> as '</w:t>
+        <w:t>', ssex as '</w:t>
       </w:r>
       <w:r>
         <w:rPr>
@@ -2521,23 +2213,7 @@
           <w:rFonts w:hint="eastAsia"/>
           <w:szCs w:val="21"/>
         </w:rPr>
-        <w:t xml:space="preserve">', </w:t>
-      </w:r>
-      <w:proofErr w:type="spellStart"/>
-      <w:r>
-        <w:rPr>
-          <w:rFonts w:hint="eastAsia"/>
-          <w:szCs w:val="21"/>
-        </w:rPr>
-        <w:t>sbirthday</w:t>
-      </w:r>
-      <w:proofErr w:type="spellEnd"/>
-      <w:r>
-        <w:rPr>
-          <w:rFonts w:hint="eastAsia"/>
-          <w:szCs w:val="21"/>
-        </w:rPr>
-        <w:t xml:space="preserve"> as '</w:t>
+        <w:t>', sbirthday as '</w:t>
       </w:r>
       <w:r>
         <w:rPr>
@@ -2551,23 +2227,14 @@
           <w:rFonts w:hint="eastAsia"/>
           <w:szCs w:val="21"/>
         </w:rPr>
-        <w:t xml:space="preserve">' from student where </w:t>
-      </w:r>
-      <w:proofErr w:type="spellStart"/>
-      <w:r>
-        <w:rPr>
-          <w:rFonts w:hint="eastAsia"/>
-          <w:szCs w:val="21"/>
-        </w:rPr>
-        <w:t>speciality</w:t>
-      </w:r>
-      <w:proofErr w:type="spellEnd"/>
-      <w:r>
-        <w:rPr>
-          <w:rFonts w:hint="eastAsia"/>
-          <w:szCs w:val="21"/>
-        </w:rPr>
-        <w:t xml:space="preserve"> = '</w:t>
+        <w:t>' fro</w:t>
+      </w:r>
+      <w:r>
+        <w:rPr>
+          <w:rFonts w:hint="eastAsia"/>
+          <w:szCs w:val="21"/>
+        </w:rPr>
+        <w:t>m student where speciality = '</w:t>
       </w:r>
       <w:r>
         <w:rPr>
@@ -2719,23 +2386,7 @@
           <w:rFonts w:hint="eastAsia"/>
           <w:szCs w:val="21"/>
         </w:rPr>
-        <w:t xml:space="preserve">select distinct </w:t>
-      </w:r>
-      <w:proofErr w:type="spellStart"/>
-      <w:r>
-        <w:rPr>
-          <w:rFonts w:hint="eastAsia"/>
-          <w:szCs w:val="21"/>
-        </w:rPr>
-        <w:t>sdept</w:t>
-      </w:r>
-      <w:proofErr w:type="spellEnd"/>
-      <w:r>
-        <w:rPr>
-          <w:rFonts w:hint="eastAsia"/>
-          <w:szCs w:val="21"/>
-        </w:rPr>
-        <w:t xml:space="preserve"> as '</w:t>
+        <w:t>select distinct sdept as '</w:t>
       </w:r>
       <w:r>
         <w:rPr>
@@ -2888,23 +2539,7 @@
           <w:rFonts w:hint="eastAsia"/>
           <w:szCs w:val="21"/>
         </w:rPr>
-        <w:t xml:space="preserve">select </w:t>
-      </w:r>
-      <w:proofErr w:type="spellStart"/>
-      <w:r>
-        <w:rPr>
-          <w:rFonts w:hint="eastAsia"/>
-          <w:szCs w:val="21"/>
-        </w:rPr>
-        <w:t>cterm</w:t>
-      </w:r>
-      <w:proofErr w:type="spellEnd"/>
-      <w:r>
-        <w:rPr>
-          <w:rFonts w:hint="eastAsia"/>
-          <w:szCs w:val="21"/>
-        </w:rPr>
-        <w:t xml:space="preserve"> as '</w:t>
+        <w:t>select cterm as '</w:t>
       </w:r>
       <w:r>
         <w:rPr>
@@ -2918,23 +2553,7 @@
           <w:rFonts w:hint="eastAsia"/>
           <w:szCs w:val="21"/>
         </w:rPr>
-        <w:t xml:space="preserve">' from teaching where </w:t>
-      </w:r>
-      <w:proofErr w:type="spellStart"/>
-      <w:r>
-        <w:rPr>
-          <w:rFonts w:hint="eastAsia"/>
-          <w:szCs w:val="21"/>
-        </w:rPr>
-        <w:t>cno</w:t>
-      </w:r>
-      <w:proofErr w:type="spellEnd"/>
-      <w:r>
-        <w:rPr>
-          <w:rFonts w:hint="eastAsia"/>
-          <w:szCs w:val="21"/>
-        </w:rPr>
-        <w:t xml:space="preserve"> = 'C01';</w:t>
+        <w:t>' from teaching where cno = 'C01';</w:t>
       </w:r>
     </w:p>
     <w:p>
@@ -3086,55 +2705,29 @@
           <w:rFonts w:hint="eastAsia"/>
           <w:szCs w:val="21"/>
         </w:rPr>
-        <w:t xml:space="preserve">select </w:t>
-      </w:r>
-      <w:proofErr w:type="spellStart"/>
-      <w:r>
-        <w:rPr>
-          <w:rFonts w:hint="eastAsia"/>
-          <w:szCs w:val="21"/>
-        </w:rPr>
-        <w:t>sno</w:t>
-      </w:r>
-      <w:proofErr w:type="spellEnd"/>
-      <w:r>
-        <w:rPr>
-          <w:rFonts w:hint="eastAsia"/>
-          <w:szCs w:val="21"/>
-        </w:rPr>
-        <w:t xml:space="preserve"> as '</w:t>
-      </w:r>
-      <w:r>
-        <w:rPr>
-          <w:rFonts w:hint="eastAsia"/>
-          <w:szCs w:val="21"/>
-        </w:rPr>
-        <w:t>学生学号</w:t>
-      </w:r>
-      <w:r>
-        <w:rPr>
-          <w:rFonts w:hint="eastAsia"/>
-          <w:szCs w:val="21"/>
-        </w:rPr>
-        <w:t xml:space="preserve">', </w:t>
-      </w:r>
-      <w:proofErr w:type="spellStart"/>
-      <w:r>
-        <w:rPr>
-          <w:rFonts w:hint="eastAsia"/>
-          <w:szCs w:val="21"/>
-        </w:rPr>
-        <w:t>cno</w:t>
-      </w:r>
-      <w:proofErr w:type="spellEnd"/>
-      <w:r>
-        <w:rPr>
-          <w:rFonts w:hint="eastAsia"/>
-          <w:szCs w:val="21"/>
-        </w:rPr>
-        <w:t xml:space="preserve"> as '</w:t>
-      </w:r>
-      <w:proofErr w:type="gramStart"/>
+        <w:t>select sno as '</w:t>
+      </w:r>
+      <w:r>
+        <w:rPr>
+          <w:rFonts w:hint="eastAsia"/>
+          <w:szCs w:val="21"/>
+        </w:rPr>
+        <w:t>学生</w:t>
+      </w:r>
+      <w:r>
+        <w:rPr>
+          <w:rFonts w:hint="eastAsia"/>
+          <w:szCs w:val="21"/>
+        </w:rPr>
+        <w:t>学号</w:t>
+      </w:r>
+      <w:r>
+        <w:rPr>
+          <w:rFonts w:hint="eastAsia"/>
+          <w:szCs w:val="21"/>
+        </w:rPr>
+        <w:t>', cno as '</w:t>
+      </w:r>
       <w:r>
         <w:rPr>
           <w:rFonts w:hint="eastAsia"/>
@@ -3142,29 +2735,12 @@
         </w:rPr>
         <w:t>课号</w:t>
       </w:r>
-      <w:proofErr w:type="gramEnd"/>
-      <w:r>
-        <w:rPr>
-          <w:rFonts w:hint="eastAsia"/>
-          <w:szCs w:val="21"/>
-        </w:rPr>
-        <w:t xml:space="preserve">' from </w:t>
-      </w:r>
-      <w:proofErr w:type="spellStart"/>
-      <w:r>
-        <w:rPr>
-          <w:rFonts w:hint="eastAsia"/>
-          <w:szCs w:val="21"/>
-        </w:rPr>
-        <w:t>sc</w:t>
-      </w:r>
-      <w:proofErr w:type="spellEnd"/>
-      <w:r>
-        <w:rPr>
-          <w:rFonts w:hint="eastAsia"/>
-          <w:szCs w:val="21"/>
-        </w:rPr>
-        <w:t xml:space="preserve"> where  degree between 80 and 90;</w:t>
+      <w:r>
+        <w:rPr>
+          <w:rFonts w:hint="eastAsia"/>
+          <w:szCs w:val="21"/>
+        </w:rPr>
+        <w:t>' from sc where  degree between 80 and 90;</w:t>
       </w:r>
     </w:p>
     <w:p>
@@ -3330,23 +2906,7 @@
           <w:rFonts w:hint="eastAsia"/>
           <w:szCs w:val="21"/>
         </w:rPr>
-        <w:t xml:space="preserve">select * from teacher where </w:t>
-      </w:r>
-      <w:proofErr w:type="spellStart"/>
-      <w:r>
-        <w:rPr>
-          <w:rFonts w:hint="eastAsia"/>
-          <w:szCs w:val="21"/>
-        </w:rPr>
-        <w:t>tsex</w:t>
-      </w:r>
-      <w:proofErr w:type="spellEnd"/>
-      <w:r>
-        <w:rPr>
-          <w:rFonts w:hint="eastAsia"/>
-          <w:szCs w:val="21"/>
-        </w:rPr>
-        <w:t xml:space="preserve"> = '</w:t>
+        <w:t>select * from teacher where tsex = '</w:t>
       </w:r>
       <w:r>
         <w:rPr>
@@ -3360,23 +2920,7 @@
           <w:rFonts w:hint="eastAsia"/>
           <w:szCs w:val="21"/>
         </w:rPr>
-        <w:t xml:space="preserve">' and </w:t>
-      </w:r>
-      <w:proofErr w:type="spellStart"/>
-      <w:r>
-        <w:rPr>
-          <w:rFonts w:hint="eastAsia"/>
-          <w:szCs w:val="21"/>
-        </w:rPr>
-        <w:t>tbirthday</w:t>
-      </w:r>
-      <w:proofErr w:type="spellEnd"/>
-      <w:r>
-        <w:rPr>
-          <w:rFonts w:hint="eastAsia"/>
-          <w:szCs w:val="21"/>
-        </w:rPr>
-        <w:t xml:space="preserve"> &lt; '1970-01-01';</w:t>
+        <w:t>' and tbirthday &lt; '1970-01-01';</w:t>
       </w:r>
     </w:p>
     <w:p>
@@ -3500,23 +3044,7 @@
           <w:rFonts w:hint="eastAsia"/>
           <w:szCs w:val="21"/>
         </w:rPr>
-        <w:t xml:space="preserve">select distinct </w:t>
-      </w:r>
-      <w:proofErr w:type="spellStart"/>
-      <w:r>
-        <w:rPr>
-          <w:rFonts w:hint="eastAsia"/>
-          <w:szCs w:val="21"/>
-        </w:rPr>
-        <w:t>sno</w:t>
-      </w:r>
-      <w:proofErr w:type="spellEnd"/>
-      <w:r>
-        <w:rPr>
-          <w:rFonts w:hint="eastAsia"/>
-          <w:szCs w:val="21"/>
-        </w:rPr>
-        <w:t xml:space="preserve"> as '</w:t>
+        <w:t>select distinct sno as '</w:t>
       </w:r>
       <w:r>
         <w:rPr>
@@ -3530,23 +3058,7 @@
           <w:rFonts w:hint="eastAsia"/>
           <w:szCs w:val="21"/>
         </w:rPr>
-        <w:t xml:space="preserve">' from </w:t>
-      </w:r>
-      <w:proofErr w:type="spellStart"/>
-      <w:r>
-        <w:rPr>
-          <w:rFonts w:hint="eastAsia"/>
-          <w:szCs w:val="21"/>
-        </w:rPr>
-        <w:t>sc</w:t>
-      </w:r>
-      <w:proofErr w:type="spellEnd"/>
-      <w:r>
-        <w:rPr>
-          <w:rFonts w:hint="eastAsia"/>
-          <w:szCs w:val="21"/>
-        </w:rPr>
-        <w:t xml:space="preserve"> where degree is not null;</w:t>
+        <w:t>' from sc where degree is not null;</w:t>
       </w:r>
     </w:p>
     <w:p>
@@ -3736,23 +3248,7 @@
           <w:rFonts w:hint="eastAsia"/>
           <w:szCs w:val="21"/>
         </w:rPr>
-        <w:t xml:space="preserve">select * from student where </w:t>
-      </w:r>
-      <w:proofErr w:type="spellStart"/>
-      <w:r>
-        <w:rPr>
-          <w:rFonts w:hint="eastAsia"/>
-          <w:szCs w:val="21"/>
-        </w:rPr>
-        <w:t>sname</w:t>
-      </w:r>
-      <w:proofErr w:type="spellEnd"/>
-      <w:r>
-        <w:rPr>
-          <w:rFonts w:hint="eastAsia"/>
-          <w:szCs w:val="21"/>
-        </w:rPr>
-        <w:t xml:space="preserve"> like '</w:t>
+        <w:t>select * from student where sname like '</w:t>
       </w:r>
       <w:r>
         <w:rPr>
@@ -3833,23 +3329,7 @@
           <w:rFonts w:hint="eastAsia"/>
           <w:szCs w:val="21"/>
         </w:rPr>
-        <w:t xml:space="preserve">select * from student where </w:t>
-      </w:r>
-      <w:proofErr w:type="spellStart"/>
-      <w:r>
-        <w:rPr>
-          <w:rFonts w:hint="eastAsia"/>
-          <w:szCs w:val="21"/>
-        </w:rPr>
-        <w:t>saddress</w:t>
-      </w:r>
-      <w:proofErr w:type="spellEnd"/>
-      <w:r>
-        <w:rPr>
-          <w:rFonts w:hint="eastAsia"/>
-          <w:szCs w:val="21"/>
-        </w:rPr>
-        <w:t xml:space="preserve"> not like '</w:t>
+        <w:t>select * from student where saddress not like '</w:t>
       </w:r>
       <w:r>
         <w:rPr>
@@ -4028,21 +3508,7 @@
         <w:rPr>
           <w:szCs w:val="21"/>
         </w:rPr>
-        <w:t xml:space="preserve">select * from </w:t>
-      </w:r>
-      <w:proofErr w:type="spellStart"/>
-      <w:r>
-        <w:rPr>
-          <w:szCs w:val="21"/>
-        </w:rPr>
-        <w:t>sc</w:t>
-      </w:r>
-      <w:proofErr w:type="spellEnd"/>
-      <w:r>
-        <w:rPr>
-          <w:szCs w:val="21"/>
-        </w:rPr>
-        <w:t xml:space="preserve"> where degree in (79,89,99);</w:t>
+        <w:t>select * from sc where degree in (79,89,99);</w:t>
       </w:r>
     </w:p>
     <w:p>
@@ -4167,55 +3633,7 @@
           <w:rFonts w:hint="eastAsia"/>
           <w:szCs w:val="21"/>
         </w:rPr>
-        <w:t xml:space="preserve">select </w:t>
-      </w:r>
-      <w:proofErr w:type="spellStart"/>
-      <w:r>
-        <w:rPr>
-          <w:rFonts w:hint="eastAsia"/>
-          <w:szCs w:val="21"/>
-        </w:rPr>
-        <w:t>sname</w:t>
-      </w:r>
-      <w:proofErr w:type="spellEnd"/>
-      <w:r>
-        <w:rPr>
-          <w:rFonts w:hint="eastAsia"/>
-          <w:szCs w:val="21"/>
-        </w:rPr>
-        <w:t xml:space="preserve">, </w:t>
-      </w:r>
-      <w:proofErr w:type="spellStart"/>
-      <w:r>
-        <w:rPr>
-          <w:rFonts w:hint="eastAsia"/>
-          <w:szCs w:val="21"/>
-        </w:rPr>
-        <w:t>saddress</w:t>
-      </w:r>
-      <w:proofErr w:type="spellEnd"/>
-      <w:r>
-        <w:rPr>
-          <w:rFonts w:hint="eastAsia"/>
-          <w:szCs w:val="21"/>
-        </w:rPr>
-        <w:t xml:space="preserve"> from student where </w:t>
-      </w:r>
-      <w:proofErr w:type="spellStart"/>
-      <w:r>
-        <w:rPr>
-          <w:rFonts w:hint="eastAsia"/>
-          <w:szCs w:val="21"/>
-        </w:rPr>
-        <w:t>ssex</w:t>
-      </w:r>
-      <w:proofErr w:type="spellEnd"/>
-      <w:r>
-        <w:rPr>
-          <w:rFonts w:hint="eastAsia"/>
-          <w:szCs w:val="21"/>
-        </w:rPr>
-        <w:t xml:space="preserve"> = '</w:t>
+        <w:t>select sname, saddress from student where ssex = '</w:t>
       </w:r>
       <w:r>
         <w:rPr>
@@ -4229,23 +3647,7 @@
           <w:rFonts w:hint="eastAsia"/>
           <w:szCs w:val="21"/>
         </w:rPr>
-        <w:t xml:space="preserve">' and </w:t>
-      </w:r>
-      <w:proofErr w:type="spellStart"/>
-      <w:r>
-        <w:rPr>
-          <w:rFonts w:hint="eastAsia"/>
-          <w:szCs w:val="21"/>
-        </w:rPr>
-        <w:t>sname</w:t>
-      </w:r>
-      <w:proofErr w:type="spellEnd"/>
-      <w:r>
-        <w:rPr>
-          <w:rFonts w:hint="eastAsia"/>
-          <w:szCs w:val="21"/>
-        </w:rPr>
-        <w:t xml:space="preserve"> like '_</w:t>
+        <w:t>' and sname like '_</w:t>
       </w:r>
       <w:r>
         <w:rPr>
@@ -4391,39 +3793,7 @@
           <w:rFonts w:hint="eastAsia"/>
           <w:szCs w:val="21"/>
         </w:rPr>
-        <w:t xml:space="preserve">select </w:t>
-      </w:r>
-      <w:proofErr w:type="spellStart"/>
-      <w:r>
-        <w:rPr>
-          <w:rFonts w:hint="eastAsia"/>
-          <w:szCs w:val="21"/>
-        </w:rPr>
-        <w:t>cname</w:t>
-      </w:r>
-      <w:proofErr w:type="spellEnd"/>
-      <w:r>
-        <w:rPr>
-          <w:rFonts w:hint="eastAsia"/>
-          <w:szCs w:val="21"/>
-        </w:rPr>
-        <w:t xml:space="preserve"> from course where </w:t>
-      </w:r>
-      <w:proofErr w:type="spellStart"/>
-      <w:r>
-        <w:rPr>
-          <w:rFonts w:hint="eastAsia"/>
-          <w:szCs w:val="21"/>
-        </w:rPr>
-        <w:t>cname</w:t>
-      </w:r>
-      <w:proofErr w:type="spellEnd"/>
-      <w:r>
-        <w:rPr>
-          <w:rFonts w:hint="eastAsia"/>
-          <w:szCs w:val="21"/>
-        </w:rPr>
-        <w:t xml:space="preserve"> like '</w:t>
+        <w:t>select cname from course where cname like '</w:t>
       </w:r>
       <w:r>
         <w:rPr>
@@ -4568,21 +3938,12 @@
         </w:rPr>
         <w:t xml:space="preserve">select * from student where </w:t>
       </w:r>
-      <w:proofErr w:type="spellStart"/>
-      <w:r>
-        <w:rPr>
-          <w:rFonts w:hint="eastAsia"/>
-          <w:szCs w:val="21"/>
-        </w:rPr>
-        <w:t>sdept</w:t>
-      </w:r>
-      <w:proofErr w:type="spellEnd"/>
-      <w:r>
-        <w:rPr>
-          <w:rFonts w:hint="eastAsia"/>
-          <w:szCs w:val="21"/>
-        </w:rPr>
-        <w:t xml:space="preserve"> in ('</w:t>
+      <w:r>
+        <w:rPr>
+          <w:rFonts w:hint="eastAsia"/>
+          <w:szCs w:val="21"/>
+        </w:rPr>
+        <w:t>sdept in ('</w:t>
       </w:r>
       <w:r>
         <w:rPr>
@@ -4798,23 +4159,7 @@
           <w:rFonts w:hint="eastAsia"/>
           <w:szCs w:val="21"/>
         </w:rPr>
-        <w:t xml:space="preserve">select count(distinct </w:t>
-      </w:r>
-      <w:proofErr w:type="spellStart"/>
-      <w:r>
-        <w:rPr>
-          <w:rFonts w:hint="eastAsia"/>
-          <w:szCs w:val="21"/>
-        </w:rPr>
-        <w:t>cno</w:t>
-      </w:r>
-      <w:proofErr w:type="spellEnd"/>
-      <w:r>
-        <w:rPr>
-          <w:rFonts w:hint="eastAsia"/>
-          <w:szCs w:val="21"/>
-        </w:rPr>
-        <w:t>) as '</w:t>
+        <w:t>select count(distinct cno) as '</w:t>
       </w:r>
       <w:r>
         <w:rPr>
@@ -4828,23 +4173,7 @@
           <w:rFonts w:hint="eastAsia"/>
           <w:szCs w:val="21"/>
         </w:rPr>
-        <w:t xml:space="preserve">' from </w:t>
-      </w:r>
-      <w:proofErr w:type="spellStart"/>
-      <w:r>
-        <w:rPr>
-          <w:rFonts w:hint="eastAsia"/>
-          <w:szCs w:val="21"/>
-        </w:rPr>
-        <w:t>sc</w:t>
-      </w:r>
-      <w:proofErr w:type="spellEnd"/>
-      <w:r>
-        <w:rPr>
-          <w:rFonts w:hint="eastAsia"/>
-          <w:szCs w:val="21"/>
-        </w:rPr>
-        <w:t>;</w:t>
+        <w:t>' from sc;</w:t>
       </w:r>
     </w:p>
     <w:p>
@@ -4996,39 +4325,7 @@
           <w:rFonts w:hint="eastAsia"/>
           <w:szCs w:val="21"/>
         </w:rPr>
-        <w:t xml:space="preserve">' from </w:t>
-      </w:r>
-      <w:proofErr w:type="spellStart"/>
-      <w:r>
-        <w:rPr>
-          <w:rFonts w:hint="eastAsia"/>
-          <w:szCs w:val="21"/>
-        </w:rPr>
-        <w:t>sc</w:t>
-      </w:r>
-      <w:proofErr w:type="spellEnd"/>
-      <w:r>
-        <w:rPr>
-          <w:rFonts w:hint="eastAsia"/>
-          <w:szCs w:val="21"/>
-        </w:rPr>
-        <w:t xml:space="preserve"> where </w:t>
-      </w:r>
-      <w:proofErr w:type="spellStart"/>
-      <w:r>
-        <w:rPr>
-          <w:rFonts w:hint="eastAsia"/>
-          <w:szCs w:val="21"/>
-        </w:rPr>
-        <w:t>cno</w:t>
-      </w:r>
-      <w:proofErr w:type="spellEnd"/>
-      <w:r>
-        <w:rPr>
-          <w:rFonts w:hint="eastAsia"/>
-          <w:szCs w:val="21"/>
-        </w:rPr>
-        <w:t xml:space="preserve"> = 'C01';</w:t>
+        <w:t>' from sc where cno = 'C01';</w:t>
       </w:r>
     </w:p>
     <w:p>
@@ -5166,23 +4463,7 @@
           <w:rFonts w:hint="eastAsia"/>
           <w:szCs w:val="21"/>
         </w:rPr>
-        <w:t xml:space="preserve">select </w:t>
-      </w:r>
-      <w:proofErr w:type="spellStart"/>
-      <w:r>
-        <w:rPr>
-          <w:rFonts w:hint="eastAsia"/>
-          <w:szCs w:val="21"/>
-        </w:rPr>
-        <w:t>sno</w:t>
-      </w:r>
-      <w:proofErr w:type="spellEnd"/>
-      <w:r>
-        <w:rPr>
-          <w:rFonts w:hint="eastAsia"/>
-          <w:szCs w:val="21"/>
-        </w:rPr>
-        <w:t xml:space="preserve"> as '</w:t>
+        <w:t>select sno as '</w:t>
       </w:r>
       <w:r>
         <w:rPr>
@@ -5210,39 +4491,7 @@
           <w:rFonts w:hint="eastAsia"/>
           <w:szCs w:val="21"/>
         </w:rPr>
-        <w:t xml:space="preserve">' from </w:t>
-      </w:r>
-      <w:proofErr w:type="spellStart"/>
-      <w:r>
-        <w:rPr>
-          <w:rFonts w:hint="eastAsia"/>
-          <w:szCs w:val="21"/>
-        </w:rPr>
-        <w:t>sc</w:t>
-      </w:r>
-      <w:proofErr w:type="spellEnd"/>
-      <w:r>
-        <w:rPr>
-          <w:rFonts w:hint="eastAsia"/>
-          <w:szCs w:val="21"/>
-        </w:rPr>
-        <w:t xml:space="preserve"> where </w:t>
-      </w:r>
-      <w:proofErr w:type="spellStart"/>
-      <w:r>
-        <w:rPr>
-          <w:rFonts w:hint="eastAsia"/>
-          <w:szCs w:val="21"/>
-        </w:rPr>
-        <w:t>cno</w:t>
-      </w:r>
-      <w:proofErr w:type="spellEnd"/>
-      <w:r>
-        <w:rPr>
-          <w:rFonts w:hint="eastAsia"/>
-          <w:szCs w:val="21"/>
-        </w:rPr>
-        <w:t xml:space="preserve"> = 'C03' order by degree desc;</w:t>
+        <w:t>' from sc where cno = 'C03' order by degree desc;</w:t>
       </w:r>
     </w:p>
     <w:p>
@@ -5375,23 +4624,7 @@
           <w:rFonts w:hint="eastAsia"/>
           <w:szCs w:val="21"/>
         </w:rPr>
-        <w:t xml:space="preserve">select </w:t>
-      </w:r>
-      <w:proofErr w:type="spellStart"/>
-      <w:r>
-        <w:rPr>
-          <w:rFonts w:hint="eastAsia"/>
-          <w:szCs w:val="21"/>
-        </w:rPr>
-        <w:t>cno</w:t>
-      </w:r>
-      <w:proofErr w:type="spellEnd"/>
-      <w:r>
-        <w:rPr>
-          <w:rFonts w:hint="eastAsia"/>
-          <w:szCs w:val="21"/>
-        </w:rPr>
-        <w:t xml:space="preserve"> as '</w:t>
+        <w:t>select cno as '</w:t>
       </w:r>
       <w:r>
         <w:rPr>
@@ -5419,39 +4652,7 @@
           <w:rFonts w:hint="eastAsia"/>
           <w:szCs w:val="21"/>
         </w:rPr>
-        <w:t xml:space="preserve">' from </w:t>
-      </w:r>
-      <w:proofErr w:type="spellStart"/>
-      <w:r>
-        <w:rPr>
-          <w:rFonts w:hint="eastAsia"/>
-          <w:szCs w:val="21"/>
-        </w:rPr>
-        <w:t>sc</w:t>
-      </w:r>
-      <w:proofErr w:type="spellEnd"/>
-      <w:r>
-        <w:rPr>
-          <w:rFonts w:hint="eastAsia"/>
-          <w:szCs w:val="21"/>
-        </w:rPr>
-        <w:t xml:space="preserve"> group by </w:t>
-      </w:r>
-      <w:proofErr w:type="spellStart"/>
-      <w:r>
-        <w:rPr>
-          <w:rFonts w:hint="eastAsia"/>
-          <w:szCs w:val="21"/>
-        </w:rPr>
-        <w:t>cno</w:t>
-      </w:r>
-      <w:proofErr w:type="spellEnd"/>
-      <w:r>
-        <w:rPr>
-          <w:rFonts w:hint="eastAsia"/>
-          <w:szCs w:val="21"/>
-        </w:rPr>
-        <w:t>;</w:t>
+        <w:t>' from sc group by cno;</w:t>
       </w:r>
     </w:p>
     <w:p>
@@ -5575,23 +4776,7 @@
           <w:rFonts w:hint="eastAsia"/>
           <w:szCs w:val="21"/>
         </w:rPr>
-        <w:t xml:space="preserve">select </w:t>
-      </w:r>
-      <w:proofErr w:type="spellStart"/>
-      <w:r>
-        <w:rPr>
-          <w:rFonts w:hint="eastAsia"/>
-          <w:szCs w:val="21"/>
-        </w:rPr>
-        <w:t>cno</w:t>
-      </w:r>
-      <w:proofErr w:type="spellEnd"/>
-      <w:r>
-        <w:rPr>
-          <w:rFonts w:hint="eastAsia"/>
-          <w:szCs w:val="21"/>
-        </w:rPr>
-        <w:t xml:space="preserve"> as '</w:t>
+        <w:t>select cno as '</w:t>
       </w:r>
       <w:r>
         <w:rPr>
@@ -5619,7 +4804,14 @@
           <w:rFonts w:hint="eastAsia"/>
           <w:szCs w:val="21"/>
         </w:rPr>
-        <w:t>', max(degree) as '</w:t>
+        <w:t>', max(deg</w:t>
+      </w:r>
+      <w:r>
+        <w:rPr>
+          <w:rFonts w:hint="eastAsia"/>
+          <w:szCs w:val="21"/>
+        </w:rPr>
+        <w:t>ree) as '</w:t>
       </w:r>
       <w:r>
         <w:rPr>
@@ -5633,39 +4825,7 @@
           <w:rFonts w:hint="eastAsia"/>
           <w:szCs w:val="21"/>
         </w:rPr>
-        <w:t xml:space="preserve">' from </w:t>
-      </w:r>
-      <w:proofErr w:type="spellStart"/>
-      <w:r>
-        <w:rPr>
-          <w:rFonts w:hint="eastAsia"/>
-          <w:szCs w:val="21"/>
-        </w:rPr>
-        <w:t>sc</w:t>
-      </w:r>
-      <w:proofErr w:type="spellEnd"/>
-      <w:r>
-        <w:rPr>
-          <w:rFonts w:hint="eastAsia"/>
-          <w:szCs w:val="21"/>
-        </w:rPr>
-        <w:t xml:space="preserve"> group by </w:t>
-      </w:r>
-      <w:proofErr w:type="spellStart"/>
-      <w:r>
-        <w:rPr>
-          <w:rFonts w:hint="eastAsia"/>
-          <w:szCs w:val="21"/>
-        </w:rPr>
-        <w:t>cno</w:t>
-      </w:r>
-      <w:proofErr w:type="spellEnd"/>
-      <w:r>
-        <w:rPr>
-          <w:rFonts w:hint="eastAsia"/>
-          <w:szCs w:val="21"/>
-        </w:rPr>
-        <w:t>;</w:t>
+        <w:t>' from sc group by cno;</w:t>
       </w:r>
     </w:p>
     <w:p>
@@ -5789,23 +4949,7 @@
           <w:rFonts w:hint="eastAsia"/>
           <w:szCs w:val="21"/>
         </w:rPr>
-        <w:t xml:space="preserve">select </w:t>
-      </w:r>
-      <w:proofErr w:type="spellStart"/>
-      <w:r>
-        <w:rPr>
-          <w:rFonts w:hint="eastAsia"/>
-          <w:szCs w:val="21"/>
-        </w:rPr>
-        <w:t>sno</w:t>
-      </w:r>
-      <w:proofErr w:type="spellEnd"/>
-      <w:r>
-        <w:rPr>
-          <w:rFonts w:hint="eastAsia"/>
-          <w:szCs w:val="21"/>
-        </w:rPr>
-        <w:t xml:space="preserve"> as '</w:t>
+        <w:t>select sno as '</w:t>
       </w:r>
       <w:r>
         <w:rPr>
@@ -5819,23 +4963,7 @@
           <w:rFonts w:hint="eastAsia"/>
           <w:szCs w:val="21"/>
         </w:rPr>
-        <w:t>', count(</w:t>
-      </w:r>
-      <w:proofErr w:type="spellStart"/>
-      <w:r>
-        <w:rPr>
-          <w:rFonts w:hint="eastAsia"/>
-          <w:szCs w:val="21"/>
-        </w:rPr>
-        <w:t>cno</w:t>
-      </w:r>
-      <w:proofErr w:type="spellEnd"/>
-      <w:r>
-        <w:rPr>
-          <w:rFonts w:hint="eastAsia"/>
-          <w:szCs w:val="21"/>
-        </w:rPr>
-        <w:t>) as '</w:t>
+        <w:t>', count(cno) as '</w:t>
       </w:r>
       <w:r>
         <w:rPr>
@@ -5863,23 +4991,7 @@
           <w:rFonts w:hint="eastAsia"/>
           <w:szCs w:val="21"/>
         </w:rPr>
-        <w:t xml:space="preserve">' from </w:t>
-      </w:r>
-      <w:proofErr w:type="spellStart"/>
-      <w:r>
-        <w:rPr>
-          <w:rFonts w:hint="eastAsia"/>
-          <w:szCs w:val="21"/>
-        </w:rPr>
-        <w:t>sc</w:t>
-      </w:r>
-      <w:proofErr w:type="spellEnd"/>
-      <w:r>
-        <w:rPr>
-          <w:rFonts w:hint="eastAsia"/>
-          <w:szCs w:val="21"/>
-        </w:rPr>
-        <w:t xml:space="preserve"> group </w:t>
+        <w:t xml:space="preserve">' from sc group </w:t>
       </w:r>
       <w:r>
         <w:rPr>
@@ -5887,39 +4999,7 @@
           <w:szCs w:val="21"/>
         </w:rPr>
         <w:lastRenderedPageBreak/>
-        <w:t xml:space="preserve">by </w:t>
-      </w:r>
-      <w:proofErr w:type="spellStart"/>
-      <w:r>
-        <w:rPr>
-          <w:rFonts w:hint="eastAsia"/>
-          <w:szCs w:val="21"/>
-        </w:rPr>
-        <w:t>sno</w:t>
-      </w:r>
-      <w:proofErr w:type="spellEnd"/>
-      <w:r>
-        <w:rPr>
-          <w:rFonts w:hint="eastAsia"/>
-          <w:szCs w:val="21"/>
-        </w:rPr>
-        <w:t xml:space="preserve"> order by count(</w:t>
-      </w:r>
-      <w:proofErr w:type="spellStart"/>
-      <w:r>
-        <w:rPr>
-          <w:rFonts w:hint="eastAsia"/>
-          <w:szCs w:val="21"/>
-        </w:rPr>
-        <w:t>cno</w:t>
-      </w:r>
-      <w:proofErr w:type="spellEnd"/>
-      <w:r>
-        <w:rPr>
-          <w:rFonts w:hint="eastAsia"/>
-          <w:szCs w:val="21"/>
-        </w:rPr>
-        <w:t>) DESC;</w:t>
+        <w:t>by sno order by count(cno) DESC;</w:t>
       </w:r>
     </w:p>
     <w:p>
@@ -6062,23 +5142,7 @@
           <w:rFonts w:hint="eastAsia"/>
           <w:szCs w:val="21"/>
         </w:rPr>
-        <w:t xml:space="preserve">select </w:t>
-      </w:r>
-      <w:proofErr w:type="spellStart"/>
-      <w:r>
-        <w:rPr>
-          <w:rFonts w:hint="eastAsia"/>
-          <w:szCs w:val="21"/>
-        </w:rPr>
-        <w:t>sno</w:t>
-      </w:r>
-      <w:proofErr w:type="spellEnd"/>
-      <w:r>
-        <w:rPr>
-          <w:rFonts w:hint="eastAsia"/>
-          <w:szCs w:val="21"/>
-        </w:rPr>
-        <w:t xml:space="preserve"> as '</w:t>
+        <w:t>select sno as '</w:t>
       </w:r>
       <w:r>
         <w:rPr>
@@ -6092,55 +5156,14 @@
           <w:rFonts w:hint="eastAsia"/>
           <w:szCs w:val="21"/>
         </w:rPr>
-        <w:t xml:space="preserve">' from </w:t>
-      </w:r>
-      <w:proofErr w:type="spellStart"/>
-      <w:r>
-        <w:rPr>
-          <w:rFonts w:hint="eastAsia"/>
-          <w:szCs w:val="21"/>
-        </w:rPr>
-        <w:t>sc</w:t>
-      </w:r>
-      <w:proofErr w:type="spellEnd"/>
-      <w:r>
-        <w:rPr>
-          <w:rFonts w:hint="eastAsia"/>
-          <w:szCs w:val="21"/>
-        </w:rPr>
-        <w:t xml:space="preserve"> group by </w:t>
-      </w:r>
-      <w:proofErr w:type="spellStart"/>
-      <w:r>
-        <w:rPr>
-          <w:rFonts w:hint="eastAsia"/>
-          <w:szCs w:val="21"/>
-        </w:rPr>
-        <w:t>sno</w:t>
-      </w:r>
-      <w:proofErr w:type="spellEnd"/>
-      <w:r>
-        <w:rPr>
-          <w:rFonts w:hint="eastAsia"/>
-          <w:szCs w:val="21"/>
-        </w:rPr>
-        <w:t xml:space="preserve"> having count(</w:t>
-      </w:r>
-      <w:proofErr w:type="spellStart"/>
-      <w:r>
-        <w:rPr>
-          <w:rFonts w:hint="eastAsia"/>
-          <w:szCs w:val="21"/>
-        </w:rPr>
-        <w:t>cno</w:t>
-      </w:r>
-      <w:proofErr w:type="spellEnd"/>
-      <w:r>
-        <w:rPr>
-          <w:rFonts w:hint="eastAsia"/>
-          <w:szCs w:val="21"/>
-        </w:rPr>
-        <w:t>) &gt; 3;</w:t>
+        <w:t xml:space="preserve">' from sc group </w:t>
+      </w:r>
+      <w:r>
+        <w:rPr>
+          <w:rFonts w:hint="eastAsia"/>
+          <w:szCs w:val="21"/>
+        </w:rPr>
+        <w:t>by sno having count(cno) &gt; 3;</w:t>
       </w:r>
     </w:p>
     <w:p>
@@ -6269,23 +5292,7 @@
           <w:rFonts w:hint="eastAsia"/>
           <w:szCs w:val="21"/>
         </w:rPr>
-        <w:t xml:space="preserve">select </w:t>
-      </w:r>
-      <w:proofErr w:type="spellStart"/>
-      <w:r>
-        <w:rPr>
-          <w:rFonts w:hint="eastAsia"/>
-          <w:szCs w:val="21"/>
-        </w:rPr>
-        <w:t>sno</w:t>
-      </w:r>
-      <w:proofErr w:type="spellEnd"/>
-      <w:r>
-        <w:rPr>
-          <w:rFonts w:hint="eastAsia"/>
-          <w:szCs w:val="21"/>
-        </w:rPr>
-        <w:t xml:space="preserve"> as '</w:t>
+        <w:t>select sno as '</w:t>
       </w:r>
       <w:r>
         <w:rPr>
@@ -6299,23 +5306,7 @@
           <w:rFonts w:hint="eastAsia"/>
           <w:szCs w:val="21"/>
         </w:rPr>
-        <w:t xml:space="preserve">', </w:t>
-      </w:r>
-      <w:proofErr w:type="spellStart"/>
-      <w:r>
-        <w:rPr>
-          <w:rFonts w:hint="eastAsia"/>
-          <w:szCs w:val="21"/>
-        </w:rPr>
-        <w:t>cno</w:t>
-      </w:r>
-      <w:proofErr w:type="spellEnd"/>
-      <w:r>
-        <w:rPr>
-          <w:rFonts w:hint="eastAsia"/>
-          <w:szCs w:val="21"/>
-        </w:rPr>
-        <w:t xml:space="preserve"> as '</w:t>
+        <w:t>', cno as '</w:t>
       </w:r>
       <w:r>
         <w:rPr>
@@ -6329,23 +5320,7 @@
           <w:rFonts w:hint="eastAsia"/>
           <w:szCs w:val="21"/>
         </w:rPr>
-        <w:t xml:space="preserve">' from </w:t>
-      </w:r>
-      <w:proofErr w:type="spellStart"/>
-      <w:r>
-        <w:rPr>
-          <w:rFonts w:hint="eastAsia"/>
-          <w:szCs w:val="21"/>
-        </w:rPr>
-        <w:t>sc</w:t>
-      </w:r>
-      <w:proofErr w:type="spellEnd"/>
-      <w:r>
-        <w:rPr>
-          <w:rFonts w:hint="eastAsia"/>
-          <w:szCs w:val="21"/>
-        </w:rPr>
-        <w:t xml:space="preserve"> where degree &lt; 60 order by degree DESC;</w:t>
+        <w:t>' from sc where degree &lt; 60 order by degree DESC;</w:t>
       </w:r>
     </w:p>
     <w:p>
@@ -6475,23 +5450,7 @@
           <w:rFonts w:hint="eastAsia"/>
           <w:szCs w:val="21"/>
         </w:rPr>
-        <w:t xml:space="preserve">select distinct </w:t>
-      </w:r>
-      <w:proofErr w:type="spellStart"/>
-      <w:r>
-        <w:rPr>
-          <w:rFonts w:hint="eastAsia"/>
-          <w:szCs w:val="21"/>
-        </w:rPr>
-        <w:t>sno</w:t>
-      </w:r>
-      <w:proofErr w:type="spellEnd"/>
-      <w:r>
-        <w:rPr>
-          <w:rFonts w:hint="eastAsia"/>
-          <w:szCs w:val="21"/>
-        </w:rPr>
-        <w:t xml:space="preserve"> as '</w:t>
+        <w:t>select distinct sno as '</w:t>
       </w:r>
       <w:r>
         <w:rPr>
@@ -6505,23 +5464,7 @@
           <w:rFonts w:hint="eastAsia"/>
           <w:szCs w:val="21"/>
         </w:rPr>
-        <w:t xml:space="preserve">' from </w:t>
-      </w:r>
-      <w:proofErr w:type="spellStart"/>
-      <w:r>
-        <w:rPr>
-          <w:rFonts w:hint="eastAsia"/>
-          <w:szCs w:val="21"/>
-        </w:rPr>
-        <w:t>sc</w:t>
-      </w:r>
-      <w:proofErr w:type="spellEnd"/>
-      <w:r>
-        <w:rPr>
-          <w:rFonts w:hint="eastAsia"/>
-          <w:szCs w:val="21"/>
-        </w:rPr>
-        <w:t>;</w:t>
+        <w:t>' from sc;</w:t>
       </w:r>
     </w:p>
     <w:p>
@@ -6652,21 +5595,12 @@
         </w:rPr>
         <w:t xml:space="preserve">select </w:t>
       </w:r>
-      <w:proofErr w:type="spellStart"/>
-      <w:r>
-        <w:rPr>
-          <w:rFonts w:hint="eastAsia"/>
-          <w:szCs w:val="21"/>
-        </w:rPr>
-        <w:t>sdept</w:t>
-      </w:r>
-      <w:proofErr w:type="spellEnd"/>
-      <w:r>
-        <w:rPr>
-          <w:rFonts w:hint="eastAsia"/>
-          <w:szCs w:val="21"/>
-        </w:rPr>
-        <w:t xml:space="preserve"> as '</w:t>
+      <w:r>
+        <w:rPr>
+          <w:rFonts w:hint="eastAsia"/>
+          <w:szCs w:val="21"/>
+        </w:rPr>
+        <w:t>sdept as '</w:t>
       </w:r>
       <w:r>
         <w:rPr>
@@ -6694,23 +5628,7 @@
           <w:rFonts w:hint="eastAsia"/>
           <w:szCs w:val="21"/>
         </w:rPr>
-        <w:t xml:space="preserve">' from student group by </w:t>
-      </w:r>
-      <w:proofErr w:type="spellStart"/>
-      <w:r>
-        <w:rPr>
-          <w:rFonts w:hint="eastAsia"/>
-          <w:szCs w:val="21"/>
-        </w:rPr>
-        <w:t>sdept</w:t>
-      </w:r>
-      <w:proofErr w:type="spellEnd"/>
-      <w:r>
-        <w:rPr>
-          <w:rFonts w:hint="eastAsia"/>
-          <w:szCs w:val="21"/>
-        </w:rPr>
-        <w:t>;</w:t>
+        <w:t>' from student group by sdept;</w:t>
       </w:r>
     </w:p>
     <w:p>
@@ -6840,23 +5758,7 @@
           <w:rFonts w:hint="eastAsia"/>
           <w:szCs w:val="21"/>
         </w:rPr>
-        <w:t xml:space="preserve">select </w:t>
-      </w:r>
-      <w:proofErr w:type="spellStart"/>
-      <w:r>
-        <w:rPr>
-          <w:rFonts w:hint="eastAsia"/>
-          <w:szCs w:val="21"/>
-        </w:rPr>
-        <w:t>sdept</w:t>
-      </w:r>
-      <w:proofErr w:type="spellEnd"/>
-      <w:r>
-        <w:rPr>
-          <w:rFonts w:hint="eastAsia"/>
-          <w:szCs w:val="21"/>
-        </w:rPr>
-        <w:t xml:space="preserve"> as '</w:t>
+        <w:t>select sdept as '</w:t>
       </w:r>
       <w:r>
         <w:rPr>
@@ -6870,23 +5772,7 @@
           <w:rFonts w:hint="eastAsia"/>
           <w:szCs w:val="21"/>
         </w:rPr>
-        <w:t xml:space="preserve">', </w:t>
-      </w:r>
-      <w:proofErr w:type="spellStart"/>
-      <w:r>
-        <w:rPr>
-          <w:rFonts w:hint="eastAsia"/>
-          <w:szCs w:val="21"/>
-        </w:rPr>
-        <w:t>ssex</w:t>
-      </w:r>
-      <w:proofErr w:type="spellEnd"/>
-      <w:r>
-        <w:rPr>
-          <w:rFonts w:hint="eastAsia"/>
-          <w:szCs w:val="21"/>
-        </w:rPr>
-        <w:t xml:space="preserve"> as '</w:t>
+        <w:t>', ssex as '</w:t>
       </w:r>
       <w:r>
         <w:rPr>
@@ -6914,39 +5800,7 @@
           <w:rFonts w:hint="eastAsia"/>
           <w:szCs w:val="21"/>
         </w:rPr>
-        <w:t xml:space="preserve">' from student group by </w:t>
-      </w:r>
-      <w:proofErr w:type="spellStart"/>
-      <w:r>
-        <w:rPr>
-          <w:rFonts w:hint="eastAsia"/>
-          <w:szCs w:val="21"/>
-        </w:rPr>
-        <w:t>sdept</w:t>
-      </w:r>
-      <w:proofErr w:type="spellEnd"/>
-      <w:r>
-        <w:rPr>
-          <w:rFonts w:hint="eastAsia"/>
-          <w:szCs w:val="21"/>
-        </w:rPr>
-        <w:t xml:space="preserve">, </w:t>
-      </w:r>
-      <w:proofErr w:type="spellStart"/>
-      <w:r>
-        <w:rPr>
-          <w:rFonts w:hint="eastAsia"/>
-          <w:szCs w:val="21"/>
-        </w:rPr>
-        <w:t>ssex</w:t>
-      </w:r>
-      <w:proofErr w:type="spellEnd"/>
-      <w:r>
-        <w:rPr>
-          <w:rFonts w:hint="eastAsia"/>
-          <w:szCs w:val="21"/>
-        </w:rPr>
-        <w:t>;</w:t>
+        <w:t>' from student group by sdept, ssex;</w:t>
       </w:r>
     </w:p>
     <w:p>
@@ -7075,23 +5929,7 @@
           <w:rFonts w:hint="eastAsia"/>
           <w:szCs w:val="21"/>
         </w:rPr>
-        <w:t xml:space="preserve">select </w:t>
-      </w:r>
-      <w:proofErr w:type="spellStart"/>
-      <w:r>
-        <w:rPr>
-          <w:rFonts w:hint="eastAsia"/>
-          <w:szCs w:val="21"/>
-        </w:rPr>
-        <w:t>speciality</w:t>
-      </w:r>
-      <w:proofErr w:type="spellEnd"/>
-      <w:r>
-        <w:rPr>
-          <w:rFonts w:hint="eastAsia"/>
-          <w:szCs w:val="21"/>
-        </w:rPr>
-        <w:t xml:space="preserve"> as '</w:t>
+        <w:t>select speciality as '</w:t>
       </w:r>
       <w:r>
         <w:rPr>
@@ -7119,23 +5957,14 @@
           <w:rFonts w:hint="eastAsia"/>
           <w:szCs w:val="21"/>
         </w:rPr>
-        <w:t xml:space="preserve">' from student group by </w:t>
-      </w:r>
-      <w:proofErr w:type="spellStart"/>
-      <w:r>
-        <w:rPr>
-          <w:rFonts w:hint="eastAsia"/>
-          <w:szCs w:val="21"/>
-        </w:rPr>
-        <w:t>speciality</w:t>
-      </w:r>
-      <w:proofErr w:type="spellEnd"/>
-      <w:r>
-        <w:rPr>
-          <w:rFonts w:hint="eastAsia"/>
-          <w:szCs w:val="21"/>
-        </w:rPr>
-        <w:t>;</w:t>
+        <w:t>' from stude</w:t>
+      </w:r>
+      <w:r>
+        <w:rPr>
+          <w:rFonts w:hint="eastAsia"/>
+          <w:szCs w:val="21"/>
+        </w:rPr>
+        <w:t>nt group by speciality;</w:t>
       </w:r>
     </w:p>
     <w:p>
@@ -7312,23 +6141,7 @@
           <w:rFonts w:hint="eastAsia"/>
           <w:szCs w:val="21"/>
         </w:rPr>
-        <w:t xml:space="preserve">select </w:t>
-      </w:r>
-      <w:proofErr w:type="spellStart"/>
-      <w:r>
-        <w:rPr>
-          <w:rFonts w:hint="eastAsia"/>
-          <w:szCs w:val="21"/>
-        </w:rPr>
-        <w:t>speciality</w:t>
-      </w:r>
-      <w:proofErr w:type="spellEnd"/>
-      <w:r>
-        <w:rPr>
-          <w:rFonts w:hint="eastAsia"/>
-          <w:szCs w:val="21"/>
-        </w:rPr>
-        <w:t xml:space="preserve"> as '</w:t>
+        <w:t>select speciality as '</w:t>
       </w:r>
       <w:r>
         <w:rPr>
@@ -7356,23 +6169,7 @@
           <w:rFonts w:hint="eastAsia"/>
           <w:szCs w:val="21"/>
         </w:rPr>
-        <w:t xml:space="preserve">' from student group by </w:t>
-      </w:r>
-      <w:proofErr w:type="spellStart"/>
-      <w:r>
-        <w:rPr>
-          <w:rFonts w:hint="eastAsia"/>
-          <w:szCs w:val="21"/>
-        </w:rPr>
-        <w:t>speciality</w:t>
-      </w:r>
-      <w:proofErr w:type="spellEnd"/>
-      <w:r>
-        <w:rPr>
-          <w:rFonts w:hint="eastAsia"/>
-          <w:szCs w:val="21"/>
-        </w:rPr>
-        <w:t>;</w:t>
+        <w:t>' from student group by speciality;</w:t>
       </w:r>
     </w:p>
     <w:p>
@@ -7494,23 +6291,7 @@
           <w:rFonts w:hint="eastAsia"/>
           <w:szCs w:val="21"/>
         </w:rPr>
-        <w:t xml:space="preserve">select </w:t>
-      </w:r>
-      <w:proofErr w:type="spellStart"/>
-      <w:r>
-        <w:rPr>
-          <w:rFonts w:hint="eastAsia"/>
-          <w:szCs w:val="21"/>
-        </w:rPr>
-        <w:t>tdept</w:t>
-      </w:r>
-      <w:proofErr w:type="spellEnd"/>
-      <w:r>
-        <w:rPr>
-          <w:rFonts w:hint="eastAsia"/>
-          <w:szCs w:val="21"/>
-        </w:rPr>
-        <w:t xml:space="preserve"> as '</w:t>
+        <w:t>select tdept as '</w:t>
       </w:r>
       <w:r>
         <w:rPr>
@@ -7538,23 +6319,14 @@
           <w:rFonts w:hint="eastAsia"/>
           <w:szCs w:val="21"/>
         </w:rPr>
-        <w:t xml:space="preserve">' from teacher group by </w:t>
-      </w:r>
-      <w:proofErr w:type="spellStart"/>
-      <w:r>
-        <w:rPr>
-          <w:rFonts w:hint="eastAsia"/>
-          <w:szCs w:val="21"/>
-        </w:rPr>
-        <w:t>tdept</w:t>
-      </w:r>
-      <w:proofErr w:type="spellEnd"/>
-      <w:r>
-        <w:rPr>
-          <w:rFonts w:hint="eastAsia"/>
-          <w:szCs w:val="21"/>
-        </w:rPr>
-        <w:t xml:space="preserve"> order by count(*) ASC;</w:t>
+        <w:t>' from teacher group by tdept order by count(</w:t>
+      </w:r>
+      <w:r>
+        <w:rPr>
+          <w:rFonts w:hint="eastAsia"/>
+          <w:szCs w:val="21"/>
+        </w:rPr>
+        <w:t>*) ASC;</w:t>
       </w:r>
     </w:p>
     <w:p>
@@ -7760,23 +6532,7 @@
           <w:rFonts w:hint="eastAsia"/>
           <w:szCs w:val="21"/>
         </w:rPr>
-        <w:t xml:space="preserve">select </w:t>
-      </w:r>
-      <w:proofErr w:type="spellStart"/>
-      <w:r>
-        <w:rPr>
-          <w:rFonts w:hint="eastAsia"/>
-          <w:szCs w:val="21"/>
-        </w:rPr>
-        <w:t>cno</w:t>
-      </w:r>
-      <w:proofErr w:type="spellEnd"/>
-      <w:r>
-        <w:rPr>
-          <w:rFonts w:hint="eastAsia"/>
-          <w:szCs w:val="21"/>
-        </w:rPr>
-        <w:t xml:space="preserve"> as '</w:t>
+        <w:t>select cno as '</w:t>
       </w:r>
       <w:r>
         <w:rPr>
@@ -7790,39 +6546,7 @@
           <w:rFonts w:hint="eastAsia"/>
           <w:szCs w:val="21"/>
         </w:rPr>
-        <w:t xml:space="preserve">' from </w:t>
-      </w:r>
-      <w:proofErr w:type="spellStart"/>
-      <w:r>
-        <w:rPr>
-          <w:rFonts w:hint="eastAsia"/>
-          <w:szCs w:val="21"/>
-        </w:rPr>
-        <w:t>sc</w:t>
-      </w:r>
-      <w:proofErr w:type="spellEnd"/>
-      <w:r>
-        <w:rPr>
-          <w:rFonts w:hint="eastAsia"/>
-          <w:szCs w:val="21"/>
-        </w:rPr>
-        <w:t xml:space="preserve"> where degree &lt; 60 group by </w:t>
-      </w:r>
-      <w:proofErr w:type="spellStart"/>
-      <w:r>
-        <w:rPr>
-          <w:rFonts w:hint="eastAsia"/>
-          <w:szCs w:val="21"/>
-        </w:rPr>
-        <w:t>cno</w:t>
-      </w:r>
-      <w:proofErr w:type="spellEnd"/>
-      <w:r>
-        <w:rPr>
-          <w:rFonts w:hint="eastAsia"/>
-          <w:szCs w:val="21"/>
-        </w:rPr>
-        <w:t xml:space="preserve"> having count(*) &gt; 10;</w:t>
+        <w:t>' from sc where degree &lt; 60 group by cno having count(*) &gt; 10;</w:t>
       </w:r>
     </w:p>
     <w:p>
@@ -7911,23 +6635,7 @@
           <w:rFonts w:hint="eastAsia"/>
           <w:szCs w:val="21"/>
         </w:rPr>
-        <w:t xml:space="preserve">select </w:t>
-      </w:r>
-      <w:proofErr w:type="spellStart"/>
-      <w:r>
-        <w:rPr>
-          <w:rFonts w:hint="eastAsia"/>
-          <w:szCs w:val="21"/>
-        </w:rPr>
-        <w:t>cno</w:t>
-      </w:r>
-      <w:proofErr w:type="spellEnd"/>
-      <w:r>
-        <w:rPr>
-          <w:rFonts w:hint="eastAsia"/>
-          <w:szCs w:val="21"/>
-        </w:rPr>
-        <w:t xml:space="preserve"> as '</w:t>
+        <w:t>select cno as '</w:t>
       </w:r>
       <w:r>
         <w:rPr>
@@ -7941,39 +6649,7 @@
           <w:rFonts w:hint="eastAsia"/>
           <w:szCs w:val="21"/>
         </w:rPr>
-        <w:t xml:space="preserve">' from </w:t>
-      </w:r>
-      <w:proofErr w:type="spellStart"/>
-      <w:r>
-        <w:rPr>
-          <w:rFonts w:hint="eastAsia"/>
-          <w:szCs w:val="21"/>
-        </w:rPr>
-        <w:t>sc</w:t>
-      </w:r>
-      <w:proofErr w:type="spellEnd"/>
-      <w:r>
-        <w:rPr>
-          <w:rFonts w:hint="eastAsia"/>
-          <w:szCs w:val="21"/>
-        </w:rPr>
-        <w:t xml:space="preserve"> group by </w:t>
-      </w:r>
-      <w:proofErr w:type="spellStart"/>
-      <w:r>
-        <w:rPr>
-          <w:rFonts w:hint="eastAsia"/>
-          <w:szCs w:val="21"/>
-        </w:rPr>
-        <w:t>cno</w:t>
-      </w:r>
-      <w:proofErr w:type="spellEnd"/>
-      <w:r>
-        <w:rPr>
-          <w:rFonts w:hint="eastAsia"/>
-          <w:szCs w:val="21"/>
-        </w:rPr>
-        <w:t xml:space="preserve"> having count(*) &gt; 10;</w:t>
+        <w:t>' from sc group by cno having count(*) &gt; 10;</w:t>
       </w:r>
     </w:p>
     <w:p>
@@ -8101,23 +6777,7 @@
           <w:rFonts w:hint="eastAsia"/>
           <w:szCs w:val="21"/>
         </w:rPr>
-        <w:t xml:space="preserve">select * from student where </w:t>
-      </w:r>
-      <w:proofErr w:type="spellStart"/>
-      <w:r>
-        <w:rPr>
-          <w:rFonts w:hint="eastAsia"/>
-          <w:szCs w:val="21"/>
-        </w:rPr>
-        <w:t>ssex</w:t>
-      </w:r>
-      <w:proofErr w:type="spellEnd"/>
-      <w:r>
-        <w:rPr>
-          <w:rFonts w:hint="eastAsia"/>
-          <w:szCs w:val="21"/>
-        </w:rPr>
-        <w:t xml:space="preserve"> = '</w:t>
+        <w:t>select * from student where ssex = '</w:t>
       </w:r>
       <w:r>
         <w:rPr>
@@ -8131,23 +6791,7 @@
           <w:rFonts w:hint="eastAsia"/>
           <w:szCs w:val="21"/>
         </w:rPr>
-        <w:t xml:space="preserve">' and </w:t>
-      </w:r>
-      <w:proofErr w:type="spellStart"/>
-      <w:r>
-        <w:rPr>
-          <w:rFonts w:hint="eastAsia"/>
-          <w:szCs w:val="21"/>
-        </w:rPr>
-        <w:t>sdept</w:t>
-      </w:r>
-      <w:proofErr w:type="spellEnd"/>
-      <w:r>
-        <w:rPr>
-          <w:rFonts w:hint="eastAsia"/>
-          <w:szCs w:val="21"/>
-        </w:rPr>
-        <w:t xml:space="preserve"> = '</w:t>
+        <w:t>' and sdept = '</w:t>
       </w:r>
       <w:r>
         <w:rPr>
@@ -8161,39 +6805,7 @@
           <w:rFonts w:hint="eastAsia"/>
           <w:szCs w:val="21"/>
         </w:rPr>
-        <w:t xml:space="preserve">' order by </w:t>
-      </w:r>
-      <w:proofErr w:type="spellStart"/>
-      <w:r>
-        <w:rPr>
-          <w:rFonts w:hint="eastAsia"/>
-          <w:szCs w:val="21"/>
-        </w:rPr>
-        <w:t>sbirthday</w:t>
-      </w:r>
-      <w:proofErr w:type="spellEnd"/>
-      <w:r>
-        <w:rPr>
-          <w:rFonts w:hint="eastAsia"/>
-          <w:szCs w:val="21"/>
-        </w:rPr>
-        <w:t xml:space="preserve"> ASC, </w:t>
-      </w:r>
-      <w:proofErr w:type="spellStart"/>
-      <w:r>
-        <w:rPr>
-          <w:rFonts w:hint="eastAsia"/>
-          <w:szCs w:val="21"/>
-        </w:rPr>
-        <w:t>saddress</w:t>
-      </w:r>
-      <w:proofErr w:type="spellEnd"/>
-      <w:r>
-        <w:rPr>
-          <w:rFonts w:hint="eastAsia"/>
-          <w:szCs w:val="21"/>
-        </w:rPr>
-        <w:t xml:space="preserve"> DESC; </w:t>
+        <w:t xml:space="preserve">' order by sbirthday ASC, saddress DESC; </w:t>
       </w:r>
     </w:p>
     <w:p>
@@ -8341,7 +6953,6 @@
       <w:pPr>
         <w:spacing w:line="400" w:lineRule="exact"/>
         <w:rPr>
-          <w:rFonts w:hint="eastAsia"/>
           <w:szCs w:val="21"/>
         </w:rPr>
       </w:pPr>
@@ -8461,7 +7072,6 @@
       <w:pPr>
         <w:spacing w:line="400" w:lineRule="exact"/>
         <w:rPr>
-          <w:rFonts w:hint="eastAsia"/>
           <w:szCs w:val="21"/>
         </w:rPr>
       </w:pPr>
@@ -8485,39 +7095,7 @@
           <w:rFonts w:hint="eastAsia"/>
           <w:szCs w:val="21"/>
         </w:rPr>
-        <w:t>YEAR(</w:t>
-      </w:r>
-      <w:proofErr w:type="gramStart"/>
-      <w:r>
-        <w:rPr>
-          <w:rFonts w:hint="eastAsia"/>
-          <w:szCs w:val="21"/>
-        </w:rPr>
-        <w:t>CURDATE(</w:t>
-      </w:r>
-      <w:proofErr w:type="gramEnd"/>
-      <w:r>
-        <w:rPr>
-          <w:rFonts w:hint="eastAsia"/>
-          <w:szCs w:val="21"/>
-        </w:rPr>
-        <w:t>)) - YEAR(</w:t>
-      </w:r>
-      <w:proofErr w:type="spellStart"/>
-      <w:r>
-        <w:rPr>
-          <w:rFonts w:hint="eastAsia"/>
-          <w:szCs w:val="21"/>
-        </w:rPr>
-        <w:t>sbirthday</w:t>
-      </w:r>
-      <w:proofErr w:type="spellEnd"/>
-      <w:r>
-        <w:rPr>
-          <w:rFonts w:hint="eastAsia"/>
-          <w:szCs w:val="21"/>
-        </w:rPr>
-        <w:t>)</w:t>
+        <w:t>YEAR(CURDATE()) - YEAR(sbirthday)</w:t>
       </w:r>
     </w:p>
     <w:p>
@@ -8582,7 +7160,6 @@
       <w:pPr>
         <w:spacing w:line="400" w:lineRule="exact"/>
         <w:rPr>
-          <w:rFonts w:hint="eastAsia"/>
           <w:szCs w:val="21"/>
         </w:rPr>
       </w:pPr>
@@ -8843,7 +7420,6 @@
       <w:pPr>
         <w:spacing w:line="400" w:lineRule="exact"/>
         <w:rPr>
-          <w:rFonts w:hint="eastAsia"/>
           <w:szCs w:val="21"/>
         </w:rPr>
       </w:pPr>
@@ -8990,7 +7566,6 @@
       <w:pPr>
         <w:spacing w:line="400" w:lineRule="exact"/>
         <w:rPr>
-          <w:rFonts w:hint="eastAsia"/>
           <w:szCs w:val="21"/>
         </w:rPr>
       </w:pPr>
@@ -9028,17 +7603,8 @@
           <w:rFonts w:hint="eastAsia"/>
           <w:szCs w:val="21"/>
         </w:rPr>
-        <w:t xml:space="preserve"> SELECT COUNT(*) FROM </w:t>
-      </w:r>
-      <w:proofErr w:type="spellStart"/>
-      <w:r>
-        <w:rPr>
-          <w:rFonts w:hint="eastAsia"/>
-          <w:szCs w:val="21"/>
-        </w:rPr>
-        <w:t>sc</w:t>
-      </w:r>
-      <w:proofErr w:type="spellEnd"/>
+        <w:t xml:space="preserve"> SELECT COUNT(*) FROM sc</w:t>
+      </w:r>
       <w:r>
         <w:rPr>
           <w:rFonts w:hint="eastAsia"/>
@@ -9102,7 +7668,14 @@
           <w:rFonts w:hint="eastAsia"/>
           <w:szCs w:val="21"/>
         </w:rPr>
-        <w:t>子句：不可以。（因为</w:t>
+        <w:t>子句：不可以。（因</w:t>
+      </w:r>
+      <w:r>
+        <w:rPr>
+          <w:rFonts w:hint="eastAsia"/>
+          <w:szCs w:val="21"/>
+        </w:rPr>
+        <w:t>为</w:t>
       </w:r>
       <w:r>
         <w:rPr>
@@ -9259,7 +7832,6 @@
       <w:pPr>
         <w:spacing w:line="400" w:lineRule="exact"/>
         <w:rPr>
-          <w:rFonts w:hint="eastAsia"/>
           <w:szCs w:val="21"/>
         </w:rPr>
       </w:pPr>
@@ -9319,7 +7891,14 @@
           <w:rFonts w:hint="eastAsia"/>
           <w:szCs w:val="21"/>
         </w:rPr>
-        <w:t>在分组之后执行，用于过滤分组后的结果。</w:t>
+        <w:t>在分组之后执行，用于过滤分组后的</w:t>
+      </w:r>
+      <w:r>
+        <w:rPr>
+          <w:rFonts w:hint="eastAsia"/>
+          <w:szCs w:val="21"/>
+        </w:rPr>
+        <w:t>结果。</w:t>
       </w:r>
     </w:p>
     <w:sectPr>
@@ -9333,7 +7912,7 @@
 </file>
 
 <file path=word/endnotes.xml><?xml version="1.0" encoding="utf-8"?>
-<w:endnotes xmlns:wpc="http://schemas.microsoft.com/office/word/2010/wordprocessingCanvas" xmlns:cx="http://schemas.microsoft.com/office/drawing/2014/chartex" xmlns:cx1="http://schemas.microsoft.com/office/drawing/2015/9/8/chartex" xmlns:cx2="http://schemas.microsoft.com/office/drawing/2015/10/21/chartex" xmlns:cx3="http://schemas.microsoft.com/office/drawing/2016/5/9/chartex" xmlns:cx4="http://schemas.microsoft.com/office/drawing/2016/5/10/chartex" xmlns:cx5="http://schemas.microsoft.com/office/drawing/2016/5/11/chartex" xmlns:cx6="http://schemas.microsoft.com/office/drawing/2016/5/12/chartex" xmlns:cx7="http://schemas.microsoft.com/office/drawing/2016/5/13/chartex" xmlns:cx8="http://schemas.microsoft.com/office/drawing/2016/5/14/chartex" xmlns:mc="http://schemas.openxmlformats.org/markup-compatibility/2006" xmlns:aink="http://schemas.microsoft.com/office/drawing/2016/ink" xmlns:am3d="http://schemas.microsoft.com/office/drawing/2017/model3d" xmlns:o="urn:schemas-microsoft-com:office:office" xmlns:oel="http://schemas.microsoft.com/office/2019/extlst" xmlns:r="http://schemas.openxmlformats.org/officeDocument/2006/relationships" xmlns:m="http://schemas.openxmlformats.org/officeDocument/2006/math" xmlns:v="urn:schemas-microsoft-com:vml" xmlns:wp14="http://schemas.microsoft.com/office/word/2010/wordprocessingDrawing" xmlns:wp="http://schemas.openxmlformats.org/drawingml/2006/wordprocessingDrawing" xmlns:w10="urn:schemas-microsoft-com:office:word" xmlns:w="http://schemas.openxmlformats.org/wordprocessingml/2006/main" xmlns:w14="http://schemas.microsoft.com/office/word/2010/wordml" xmlns:w15="http://schemas.microsoft.com/office/word/2012/wordml" xmlns:w16cex="http://schemas.microsoft.com/office/word/2018/wordml/cex" xmlns:w16cid="http://schemas.microsoft.com/office/word/2016/wordml/cid" xmlns:w16="http://schemas.microsoft.com/office/word/2018/wordml" xmlns:w16sdtdh="http://schemas.microsoft.com/office/word/2020/wordml/sdtdatahash" xmlns:w16se="http://schemas.microsoft.com/office/word/2015/wordml/symex" xmlns:wpg="http://schemas.microsoft.com/office/word/2010/wordprocessingGroup" xmlns:wpi="http://schemas.microsoft.com/office/word/2010/wordprocessingInk" xmlns:wne="http://schemas.microsoft.com/office/word/2006/wordml" xmlns:wps="http://schemas.microsoft.com/office/word/2010/wordprocessingShape" mc:Ignorable="w14 w15 w16se w16cid w16 w16cex w16sdtdh wp14">
+<w:endnotes xmlns:wpc="http://schemas.microsoft.com/office/word/2010/wordprocessingCanvas" xmlns:cx="http://schemas.microsoft.com/office/drawing/2014/chartex" xmlns:mc="http://schemas.openxmlformats.org/markup-compatibility/2006" xmlns:o="urn:schemas-microsoft-com:office:office" xmlns:r="http://schemas.openxmlformats.org/officeDocument/2006/relationships" xmlns:m="http://schemas.openxmlformats.org/officeDocument/2006/math" xmlns:v="urn:schemas-microsoft-com:vml" xmlns:wp14="http://schemas.microsoft.com/office/word/2010/wordprocessingDrawing" xmlns:wp="http://schemas.openxmlformats.org/drawingml/2006/wordprocessingDrawing" xmlns:w10="urn:schemas-microsoft-com:office:word" xmlns:w="http://schemas.openxmlformats.org/wordprocessingml/2006/main" xmlns:w14="http://schemas.microsoft.com/office/word/2010/wordml" xmlns:w15="http://schemas.microsoft.com/office/word/2012/wordml" xmlns:w16se="http://schemas.microsoft.com/office/word/2015/wordml/symex" xmlns:wpg="http://schemas.microsoft.com/office/word/2010/wordprocessingGroup" xmlns:wpi="http://schemas.microsoft.com/office/word/2010/wordprocessingInk" xmlns:wne="http://schemas.microsoft.com/office/word/2006/wordml" xmlns:wps="http://schemas.microsoft.com/office/word/2010/wordprocessingShape" mc:Ignorable="w14 w15 w16se wp14">
   <w:endnote w:type="separator" w:id="-1">
     <w:p>
       <w:r>
@@ -9352,7 +7931,7 @@
 </file>
 
 <file path=word/footnotes.xml><?xml version="1.0" encoding="utf-8"?>
-<w:footnotes xmlns:wpc="http://schemas.microsoft.com/office/word/2010/wordprocessingCanvas" xmlns:cx="http://schemas.microsoft.com/office/drawing/2014/chartex" xmlns:cx1="http://schemas.microsoft.com/office/drawing/2015/9/8/chartex" xmlns:cx2="http://schemas.microsoft.com/office/drawing/2015/10/21/chartex" xmlns:cx3="http://schemas.microsoft.com/office/drawing/2016/5/9/chartex" xmlns:cx4="http://schemas.microsoft.com/office/drawing/2016/5/10/chartex" xmlns:cx5="http://schemas.microsoft.com/office/drawing/2016/5/11/chartex" xmlns:cx6="http://schemas.microsoft.com/office/drawing/2016/5/12/chartex" xmlns:cx7="http://schemas.microsoft.com/office/drawing/2016/5/13/chartex" xmlns:cx8="http://schemas.microsoft.com/office/drawing/2016/5/14/chartex" xmlns:mc="http://schemas.openxmlformats.org/markup-compatibility/2006" xmlns:aink="http://schemas.microsoft.com/office/drawing/2016/ink" xmlns:am3d="http://schemas.microsoft.com/office/drawing/2017/model3d" xmlns:o="urn:schemas-microsoft-com:office:office" xmlns:oel="http://schemas.microsoft.com/office/2019/extlst" xmlns:r="http://schemas.openxmlformats.org/officeDocument/2006/relationships" xmlns:m="http://schemas.openxmlformats.org/officeDocument/2006/math" xmlns:v="urn:schemas-microsoft-com:vml" xmlns:wp14="http://schemas.microsoft.com/office/word/2010/wordprocessingDrawing" xmlns:wp="http://schemas.openxmlformats.org/drawingml/2006/wordprocessingDrawing" xmlns:w10="urn:schemas-microsoft-com:office:word" xmlns:w="http://schemas.openxmlformats.org/wordprocessingml/2006/main" xmlns:w14="http://schemas.microsoft.com/office/word/2010/wordml" xmlns:w15="http://schemas.microsoft.com/office/word/2012/wordml" xmlns:w16cex="http://schemas.microsoft.com/office/word/2018/wordml/cex" xmlns:w16cid="http://schemas.microsoft.com/office/word/2016/wordml/cid" xmlns:w16="http://schemas.microsoft.com/office/word/2018/wordml" xmlns:w16sdtdh="http://schemas.microsoft.com/office/word/2020/wordml/sdtdatahash" xmlns:w16se="http://schemas.microsoft.com/office/word/2015/wordml/symex" xmlns:wpg="http://schemas.microsoft.com/office/word/2010/wordprocessingGroup" xmlns:wpi="http://schemas.microsoft.com/office/word/2010/wordprocessingInk" xmlns:wne="http://schemas.microsoft.com/office/word/2006/wordml" xmlns:wps="http://schemas.microsoft.com/office/word/2010/wordprocessingShape" mc:Ignorable="w14 w15 w16se w16cid w16 w16cex w16sdtdh wp14">
+<w:footnotes xmlns:wpc="http://schemas.microsoft.com/office/word/2010/wordprocessingCanvas" xmlns:cx="http://schemas.microsoft.com/office/drawing/2014/chartex" xmlns:mc="http://schemas.openxmlformats.org/markup-compatibility/2006" xmlns:o="urn:schemas-microsoft-com:office:office" xmlns:r="http://schemas.openxmlformats.org/officeDocument/2006/relationships" xmlns:m="http://schemas.openxmlformats.org/officeDocument/2006/math" xmlns:v="urn:schemas-microsoft-com:vml" xmlns:wp14="http://schemas.microsoft.com/office/word/2010/wordprocessingDrawing" xmlns:wp="http://schemas.openxmlformats.org/drawingml/2006/wordprocessingDrawing" xmlns:w10="urn:schemas-microsoft-com:office:word" xmlns:w="http://schemas.openxmlformats.org/wordprocessingml/2006/main" xmlns:w14="http://schemas.microsoft.com/office/word/2010/wordml" xmlns:w15="http://schemas.microsoft.com/office/word/2012/wordml" xmlns:w16se="http://schemas.microsoft.com/office/word/2015/wordml/symex" xmlns:wpg="http://schemas.microsoft.com/office/word/2010/wordprocessingGroup" xmlns:wpi="http://schemas.microsoft.com/office/word/2010/wordprocessingInk" xmlns:wne="http://schemas.microsoft.com/office/word/2006/wordml" xmlns:wps="http://schemas.microsoft.com/office/word/2010/wordprocessingShape" mc:Ignorable="w14 w15 w16se wp14">
   <w:footnote w:type="separator" w:id="-1">
     <w:p>
       <w:r>
@@ -9371,7 +7950,7 @@
 </file>
 
 <file path=word/numbering.xml><?xml version="1.0" encoding="utf-8"?>
-<w:numbering xmlns:wpc="http://schemas.microsoft.com/office/word/2010/wordprocessingCanvas" xmlns:cx="http://schemas.microsoft.com/office/drawing/2014/chartex" xmlns:cx1="http://schemas.microsoft.com/office/drawing/2015/9/8/chartex" xmlns:cx2="http://schemas.microsoft.com/office/drawing/2015/10/21/chartex" xmlns:cx3="http://schemas.microsoft.com/office/drawing/2016/5/9/chartex" xmlns:cx4="http://schemas.microsoft.com/office/drawing/2016/5/10/chartex" xmlns:cx5="http://schemas.microsoft.com/office/drawing/2016/5/11/chartex" xmlns:cx6="http://schemas.microsoft.com/office/drawing/2016/5/12/chartex" xmlns:cx7="http://schemas.microsoft.com/office/drawing/2016/5/13/chartex" xmlns:cx8="http://schemas.microsoft.com/office/drawing/2016/5/14/chartex" xmlns:mc="http://schemas.openxmlformats.org/markup-compatibility/2006" xmlns:aink="http://schemas.microsoft.com/office/drawing/2016/ink" xmlns:am3d="http://schemas.microsoft.com/office/drawing/2017/model3d" xmlns:o="urn:schemas-microsoft-com:office:office" xmlns:oel="http://schemas.microsoft.com/office/2019/extlst" xmlns:r="http://schemas.openxmlformats.org/officeDocument/2006/relationships" xmlns:m="http://schemas.openxmlformats.org/officeDocument/2006/math" xmlns:v="urn:schemas-microsoft-com:vml" xmlns:wp14="http://schemas.microsoft.com/office/word/2010/wordprocessingDrawing" xmlns:wp="http://schemas.openxmlformats.org/drawingml/2006/wordprocessingDrawing" xmlns:w10="urn:schemas-microsoft-com:office:word" xmlns:w="http://schemas.openxmlformats.org/wordprocessingml/2006/main" xmlns:w14="http://schemas.microsoft.com/office/word/2010/wordml" xmlns:w15="http://schemas.microsoft.com/office/word/2012/wordml" xmlns:w16cex="http://schemas.microsoft.com/office/word/2018/wordml/cex" xmlns:w16cid="http://schemas.microsoft.com/office/word/2016/wordml/cid" xmlns:w16="http://schemas.microsoft.com/office/word/2018/wordml" xmlns:w16sdtdh="http://schemas.microsoft.com/office/word/2020/wordml/sdtdatahash" xmlns:w16se="http://schemas.microsoft.com/office/word/2015/wordml/symex" xmlns:wpg="http://schemas.microsoft.com/office/word/2010/wordprocessingGroup" xmlns:wpi="http://schemas.microsoft.com/office/word/2010/wordprocessingInk" xmlns:wne="http://schemas.microsoft.com/office/word/2006/wordml" xmlns:wps="http://schemas.microsoft.com/office/word/2010/wordprocessingShape" mc:Ignorable="w14 w15 w16se w16cid w16 w16cex w16sdtdh wp14">
+<w:numbering xmlns:wpc="http://schemas.microsoft.com/office/word/2010/wordprocessingCanvas" xmlns:cx="http://schemas.microsoft.com/office/drawing/2014/chartex" xmlns:mc="http://schemas.openxmlformats.org/markup-compatibility/2006" xmlns:o="urn:schemas-microsoft-com:office:office" xmlns:r="http://schemas.openxmlformats.org/officeDocument/2006/relationships" xmlns:m="http://schemas.openxmlformats.org/officeDocument/2006/math" xmlns:v="urn:schemas-microsoft-com:vml" xmlns:wp14="http://schemas.microsoft.com/office/word/2010/wordprocessingDrawing" xmlns:wp="http://schemas.openxmlformats.org/drawingml/2006/wordprocessingDrawing" xmlns:w10="urn:schemas-microsoft-com:office:word" xmlns:w="http://schemas.openxmlformats.org/wordprocessingml/2006/main" xmlns:w14="http://schemas.microsoft.com/office/word/2010/wordml" xmlns:w15="http://schemas.microsoft.com/office/word/2012/wordml" xmlns:w16se="http://schemas.microsoft.com/office/word/2015/wordml/symex" xmlns:wpg="http://schemas.microsoft.com/office/word/2010/wordprocessingGroup" xmlns:wpi="http://schemas.microsoft.com/office/word/2010/wordprocessingInk" xmlns:wne="http://schemas.microsoft.com/office/word/2006/wordml" xmlns:wps="http://schemas.microsoft.com/office/word/2010/wordprocessingShape" mc:Ignorable="w14 w15 w16se wp14">
   <w:abstractNum w:abstractNumId="0" w15:restartNumberingAfterBreak="0">
     <w:nsid w:val="09ED3804"/>
     <w:multiLevelType w:val="singleLevel"/>
@@ -9485,20 +8064,20 @@
       <w:lvlJc w:val="left"/>
     </w:lvl>
   </w:abstractNum>
-  <w:num w:numId="1" w16cid:durableId="2104453093">
+  <w:num w:numId="1">
     <w:abstractNumId w:val="1"/>
   </w:num>
-  <w:num w:numId="2" w16cid:durableId="1695693185">
+  <w:num w:numId="2">
     <w:abstractNumId w:val="0"/>
   </w:num>
-  <w:num w:numId="3" w16cid:durableId="1611887955">
+  <w:num w:numId="3">
     <w:abstractNumId w:val="2"/>
   </w:num>
 </w:numbering>
 </file>
 
 <file path=word/styles.xml><?xml version="1.0" encoding="utf-8"?>
-<w:styles xmlns:mc="http://schemas.openxmlformats.org/markup-compatibility/2006" xmlns:r="http://schemas.openxmlformats.org/officeDocument/2006/relationships" xmlns:w="http://schemas.openxmlformats.org/wordprocessingml/2006/main" xmlns:w14="http://schemas.microsoft.com/office/word/2010/wordml" xmlns:w15="http://schemas.microsoft.com/office/word/2012/wordml" xmlns:w16cex="http://schemas.microsoft.com/office/word/2018/wordml/cex" xmlns:w16cid="http://schemas.microsoft.com/office/word/2016/wordml/cid" xmlns:w16="http://schemas.microsoft.com/office/word/2018/wordml" xmlns:w16sdtdh="http://schemas.microsoft.com/office/word/2020/wordml/sdtdatahash" xmlns:w16se="http://schemas.microsoft.com/office/word/2015/wordml/symex" mc:Ignorable="w14 w15 w16se w16cid w16 w16cex w16sdtdh">
+<w:styles xmlns:mc="http://schemas.openxmlformats.org/markup-compatibility/2006" xmlns:r="http://schemas.openxmlformats.org/officeDocument/2006/relationships" xmlns:w="http://schemas.openxmlformats.org/wordprocessingml/2006/main" xmlns:w14="http://schemas.microsoft.com/office/word/2010/wordml" xmlns:w15="http://schemas.microsoft.com/office/word/2012/wordml" xmlns:w16se="http://schemas.microsoft.com/office/word/2015/wordml/symex" mc:Ignorable="w14 w15 w16se">
   <w:docDefaults>
     <w:rPrDefault>
       <w:rPr>
@@ -9508,7 +8087,7 @@
     </w:rPrDefault>
     <w:pPrDefault/>
   </w:docDefaults>
-  <w:latentStyles w:defLockedState="0" w:defUIPriority="0" w:defSemiHidden="0" w:defUnhideWhenUsed="0" w:defQFormat="0" w:count="376">
+  <w:latentStyles w:defLockedState="0" w:defUIPriority="0" w:defSemiHidden="0" w:defUnhideWhenUsed="0" w:defQFormat="0" w:count="371">
     <w:lsdException w:name="Normal" w:qFormat="1"/>
     <w:lsdException w:name="heading 1" w:qFormat="1"/>
     <w:lsdException w:name="heading 2" w:semiHidden="1" w:unhideWhenUsed="1" w:qFormat="1"/>
@@ -9791,11 +8370,6 @@
     <w:lsdException w:name="List Table 5 Dark Accent 6" w:uiPriority="50"/>
     <w:lsdException w:name="List Table 6 Colorful Accent 6" w:uiPriority="51"/>
     <w:lsdException w:name="List Table 7 Colorful Accent 6" w:uiPriority="52"/>
-    <w:lsdException w:name="Mention" w:semiHidden="1" w:uiPriority="99" w:unhideWhenUsed="1"/>
-    <w:lsdException w:name="Smart Hyperlink" w:semiHidden="1" w:uiPriority="99" w:unhideWhenUsed="1"/>
-    <w:lsdException w:name="Hashtag" w:semiHidden="1" w:uiPriority="99" w:unhideWhenUsed="1"/>
-    <w:lsdException w:name="Unresolved Mention" w:semiHidden="1" w:uiPriority="99" w:unhideWhenUsed="1"/>
-    <w:lsdException w:name="Smart Link" w:semiHidden="1" w:uiPriority="99" w:unhideWhenUsed="1"/>
   </w:latentStyles>
   <w:style w:type="paragraph" w:default="1" w:styleId="a">
     <w:name w:val="Normal"/>

</xml_diff>